<commit_message>
DSA topic day-1 addedd
</commit_message>
<xml_diff>
--- a/productBasedPreparation/DSA/Arrays/ArrayDSANOTES.docx
+++ b/productBasedPreparation/DSA/Arrays/ArrayDSANOTES.docx
@@ -1696,6 +1696,1910 @@
     <w:p/>
     <w:p/>
     <w:p/>
+    <w:p/>
+    <w:p/>
+    <w:p/>
+    <w:p/>
+    <w:p>
+      <w:pPr>
+        <w:rPr>
+          <w:b/>
+          <w:bCs/>
+        </w:rPr>
+      </w:pPr>
+      <w:r>
+        <w:rPr>
+          <w:rFonts w:ascii="Segoe UI Emoji" w:hAnsi="Segoe UI Emoji" w:cs="Segoe UI Emoji"/>
+          <w:b/>
+          <w:bCs/>
+        </w:rPr>
+        <w:t>📘</w:t>
+      </w:r>
+      <w:r>
+        <w:rPr>
+          <w:b/>
+          <w:bCs/>
+        </w:rPr>
+        <w:t xml:space="preserve"> DSA Day 2 – Arrays Theory</w:t>
+      </w:r>
+    </w:p>
+    <w:p>
+      <w:pPr>
+        <w:rPr>
+          <w:b/>
+          <w:bCs/>
+        </w:rPr>
+      </w:pPr>
+      <w:r>
+        <w:rPr>
+          <w:b/>
+          <w:bCs/>
+        </w:rPr>
+        <w:t>1. Array Insertion</w:t>
+      </w:r>
+    </w:p>
+    <w:p>
+      <w:pPr>
+        <w:rPr>
+          <w:b/>
+          <w:bCs/>
+        </w:rPr>
+      </w:pPr>
+      <w:r>
+        <w:rPr>
+          <w:b/>
+          <w:bCs/>
+        </w:rPr>
+        <w:t>Definition</w:t>
+      </w:r>
+    </w:p>
+    <w:p>
+      <w:r>
+        <w:rPr>
+          <w:b/>
+          <w:bCs/>
+        </w:rPr>
+        <w:t>Array insertion</w:t>
+      </w:r>
+      <w:r>
+        <w:t xml:space="preserve"> is the process of adding a new element at a specific position in an array.</w:t>
+      </w:r>
+    </w:p>
+    <w:p>
+      <w:r>
+        <w:t xml:space="preserve">Since arrays have a fixed size and store elements in </w:t>
+      </w:r>
+      <w:r>
+        <w:rPr>
+          <w:b/>
+          <w:bCs/>
+        </w:rPr>
+        <w:t>contiguous memory</w:t>
+      </w:r>
+      <w:r>
+        <w:t>, existing elements must be shifted to the right before inserting the new element.</w:t>
+      </w:r>
+    </w:p>
+    <w:p>
+      <w:pPr>
+        <w:rPr>
+          <w:b/>
+          <w:bCs/>
+        </w:rPr>
+      </w:pPr>
+      <w:r>
+        <w:rPr>
+          <w:b/>
+          <w:bCs/>
+        </w:rPr>
+        <w:t>Example</w:t>
+      </w:r>
+    </w:p>
+    <w:p>
+      <w:r>
+        <w:t>Before insertion:</w:t>
+      </w:r>
+    </w:p>
+    <w:p>
+      <w:proofErr w:type="gramStart"/>
+      <w:r>
+        <w:t>Index :</w:t>
+      </w:r>
+      <w:proofErr w:type="gramEnd"/>
+      <w:r>
+        <w:t xml:space="preserve"> 0   1   2   3   4</w:t>
+      </w:r>
+    </w:p>
+    <w:p>
+      <w:r>
+        <w:t>Value :</w:t>
+      </w:r>
+      <w:proofErr w:type="gramStart"/>
+      <w:r>
+        <w:t>10  20</w:t>
+      </w:r>
+      <w:proofErr w:type="gramEnd"/>
+      <w:r>
+        <w:t xml:space="preserve">  </w:t>
+      </w:r>
+      <w:proofErr w:type="gramStart"/>
+      <w:r>
+        <w:t>30  40</w:t>
+      </w:r>
+      <w:proofErr w:type="gramEnd"/>
+      <w:r>
+        <w:t xml:space="preserve">  50</w:t>
+      </w:r>
+    </w:p>
+    <w:p>
+      <w:r>
+        <w:t xml:space="preserve">Insert </w:t>
+      </w:r>
+      <w:r>
+        <w:rPr>
+          <w:b/>
+          <w:bCs/>
+        </w:rPr>
+        <w:t>25</w:t>
+      </w:r>
+      <w:r>
+        <w:t xml:space="preserve"> at </w:t>
+      </w:r>
+      <w:r>
+        <w:rPr>
+          <w:b/>
+          <w:bCs/>
+        </w:rPr>
+        <w:t>index 2</w:t>
+      </w:r>
+      <w:r>
+        <w:t>.</w:t>
+      </w:r>
+    </w:p>
+    <w:p>
+      <w:r>
+        <w:t>After insertion:</w:t>
+      </w:r>
+    </w:p>
+    <w:p>
+      <w:proofErr w:type="gramStart"/>
+      <w:r>
+        <w:t>Index :</w:t>
+      </w:r>
+      <w:proofErr w:type="gramEnd"/>
+      <w:r>
+        <w:t xml:space="preserve"> 0   1   2   3   4   5</w:t>
+      </w:r>
+    </w:p>
+    <w:p>
+      <w:r>
+        <w:t>Value :</w:t>
+      </w:r>
+      <w:proofErr w:type="gramStart"/>
+      <w:r>
+        <w:t>10  20</w:t>
+      </w:r>
+      <w:proofErr w:type="gramEnd"/>
+      <w:r>
+        <w:t xml:space="preserve">  </w:t>
+      </w:r>
+      <w:proofErr w:type="gramStart"/>
+      <w:r>
+        <w:t>25  30</w:t>
+      </w:r>
+      <w:proofErr w:type="gramEnd"/>
+      <w:r>
+        <w:t xml:space="preserve">  </w:t>
+      </w:r>
+      <w:proofErr w:type="gramStart"/>
+      <w:r>
+        <w:t>40  50</w:t>
+      </w:r>
+      <w:proofErr w:type="gramEnd"/>
+    </w:p>
+    <w:p>
+      <w:r>
+        <w:t>Notice that:</w:t>
+      </w:r>
+    </w:p>
+    <w:p>
+      <w:pPr>
+        <w:numPr>
+          <w:ilvl w:val="0"/>
+          <w:numId w:val="9"/>
+        </w:numPr>
+      </w:pPr>
+      <w:r>
+        <w:t xml:space="preserve">30 moves to index 3 </w:t>
+      </w:r>
+    </w:p>
+    <w:p>
+      <w:pPr>
+        <w:numPr>
+          <w:ilvl w:val="0"/>
+          <w:numId w:val="9"/>
+        </w:numPr>
+      </w:pPr>
+      <w:r>
+        <w:t xml:space="preserve">40 moves to index 4 </w:t>
+      </w:r>
+    </w:p>
+    <w:p>
+      <w:pPr>
+        <w:numPr>
+          <w:ilvl w:val="0"/>
+          <w:numId w:val="9"/>
+        </w:numPr>
+      </w:pPr>
+      <w:r>
+        <w:t xml:space="preserve">50 moves to index 5 </w:t>
+      </w:r>
+    </w:p>
+    <w:p>
+      <w:pPr>
+        <w:rPr>
+          <w:b/>
+          <w:bCs/>
+        </w:rPr>
+      </w:pPr>
+      <w:r>
+        <w:rPr>
+          <w:b/>
+          <w:bCs/>
+        </w:rPr>
+        <w:t>Algorithm</w:t>
+      </w:r>
+    </w:p>
+    <w:p>
+      <w:pPr>
+        <w:numPr>
+          <w:ilvl w:val="0"/>
+          <w:numId w:val="10"/>
+        </w:numPr>
+      </w:pPr>
+      <w:r>
+        <w:t xml:space="preserve">Create an array with enough space. </w:t>
+      </w:r>
+    </w:p>
+    <w:p>
+      <w:pPr>
+        <w:numPr>
+          <w:ilvl w:val="0"/>
+          <w:numId w:val="10"/>
+        </w:numPr>
+      </w:pPr>
+      <w:r>
+        <w:t xml:space="preserve">Start from the last element. </w:t>
+      </w:r>
+    </w:p>
+    <w:p>
+      <w:pPr>
+        <w:numPr>
+          <w:ilvl w:val="0"/>
+          <w:numId w:val="10"/>
+        </w:numPr>
+      </w:pPr>
+      <w:r>
+        <w:t xml:space="preserve">Shift elements one position to the right until the insertion index. </w:t>
+      </w:r>
+    </w:p>
+    <w:p>
+      <w:pPr>
+        <w:numPr>
+          <w:ilvl w:val="0"/>
+          <w:numId w:val="10"/>
+        </w:numPr>
+      </w:pPr>
+      <w:r>
+        <w:t xml:space="preserve">Insert the new element. </w:t>
+      </w:r>
+    </w:p>
+    <w:p>
+      <w:pPr>
+        <w:numPr>
+          <w:ilvl w:val="0"/>
+          <w:numId w:val="10"/>
+        </w:numPr>
+      </w:pPr>
+      <w:r>
+        <w:t xml:space="preserve">Print the updated array. </w:t>
+      </w:r>
+    </w:p>
+    <w:p>
+      <w:r>
+        <w:t>Time Complexity</w:t>
+      </w:r>
+      <w:r>
+        <w:t xml:space="preserve"> </w:t>
+      </w:r>
+      <w:r>
+        <w:t>O(n)</w:t>
+      </w:r>
+    </w:p>
+    <w:p>
+      <w:pPr>
+        <w:rPr>
+          <w:b/>
+          <w:bCs/>
+        </w:rPr>
+      </w:pPr>
+      <w:r>
+        <w:rPr>
+          <w:b/>
+          <w:bCs/>
+        </w:rPr>
+        <w:t>Why?</w:t>
+      </w:r>
+    </w:p>
+    <w:p>
+      <w:r>
+        <w:t>In the worst case, all elements may need to be shifted one position to the right.</w:t>
+      </w:r>
+    </w:p>
+    <w:p>
+      <w:r>
+        <w:lastRenderedPageBreak/>
+        <w:t>Space Complexity</w:t>
+      </w:r>
+    </w:p>
+    <w:p>
+      <w:proofErr w:type="gramStart"/>
+      <w:r>
+        <w:t>O(</w:t>
+      </w:r>
+      <w:proofErr w:type="gramEnd"/>
+      <w:r>
+        <w:t>1)</w:t>
+      </w:r>
+    </w:p>
+    <w:p>
+      <w:r>
+        <w:t>(When using the existing array with available space.)</w:t>
+      </w:r>
+    </w:p>
+    <w:p>
+      <w:pPr>
+        <w:rPr>
+          <w:b/>
+          <w:bCs/>
+        </w:rPr>
+      </w:pPr>
+      <w:r>
+        <w:rPr>
+          <w:b/>
+          <w:bCs/>
+        </w:rPr>
+        <w:t>2. Array Deletion</w:t>
+      </w:r>
+    </w:p>
+    <w:p>
+      <w:pPr>
+        <w:rPr>
+          <w:b/>
+          <w:bCs/>
+        </w:rPr>
+      </w:pPr>
+      <w:r>
+        <w:rPr>
+          <w:b/>
+          <w:bCs/>
+        </w:rPr>
+        <w:t>Definition</w:t>
+      </w:r>
+    </w:p>
+    <w:p>
+      <w:r>
+        <w:rPr>
+          <w:b/>
+          <w:bCs/>
+        </w:rPr>
+        <w:t>Array deletion</w:t>
+      </w:r>
+      <w:r>
+        <w:t xml:space="preserve"> is the process of removing an element from a specific position.</w:t>
+      </w:r>
+    </w:p>
+    <w:p>
+      <w:r>
+        <w:t>After deleting the element, all remaining elements are shifted one position to the left.</w:t>
+      </w:r>
+    </w:p>
+    <w:p>
+      <w:pPr>
+        <w:rPr>
+          <w:b/>
+          <w:bCs/>
+        </w:rPr>
+      </w:pPr>
+      <w:r>
+        <w:rPr>
+          <w:b/>
+          <w:bCs/>
+        </w:rPr>
+        <w:t>Example</w:t>
+      </w:r>
+    </w:p>
+    <w:p>
+      <w:r>
+        <w:t>Before deletion:</w:t>
+      </w:r>
+    </w:p>
+    <w:p>
+      <w:r>
+        <w:t>10 20 30 40 50</w:t>
+      </w:r>
+    </w:p>
+    <w:p>
+      <w:r>
+        <w:t xml:space="preserve">Delete </w:t>
+      </w:r>
+      <w:r>
+        <w:rPr>
+          <w:b/>
+          <w:bCs/>
+        </w:rPr>
+        <w:t>30</w:t>
+      </w:r>
+    </w:p>
+    <w:p>
+      <w:r>
+        <w:t>After deletion:</w:t>
+      </w:r>
+    </w:p>
+    <w:p>
+      <w:r>
+        <w:t>10 20 40 50</w:t>
+      </w:r>
+    </w:p>
+    <w:p>
+      <w:pPr>
+        <w:rPr>
+          <w:b/>
+          <w:bCs/>
+        </w:rPr>
+      </w:pPr>
+      <w:r>
+        <w:rPr>
+          <w:b/>
+          <w:bCs/>
+        </w:rPr>
+        <w:t>Algorithm</w:t>
+      </w:r>
+    </w:p>
+    <w:p>
+      <w:pPr>
+        <w:numPr>
+          <w:ilvl w:val="0"/>
+          <w:numId w:val="11"/>
+        </w:numPr>
+      </w:pPr>
+      <w:r>
+        <w:t xml:space="preserve">Find the element or index to delete. </w:t>
+      </w:r>
+    </w:p>
+    <w:p>
+      <w:pPr>
+        <w:numPr>
+          <w:ilvl w:val="0"/>
+          <w:numId w:val="11"/>
+        </w:numPr>
+      </w:pPr>
+      <w:r>
+        <w:t xml:space="preserve">Shift all elements after it one position to the left. </w:t>
+      </w:r>
+    </w:p>
+    <w:p>
+      <w:pPr>
+        <w:numPr>
+          <w:ilvl w:val="0"/>
+          <w:numId w:val="11"/>
+        </w:numPr>
+      </w:pPr>
+      <w:r>
+        <w:t xml:space="preserve">Ignore the last duplicate position. </w:t>
+      </w:r>
+    </w:p>
+    <w:p>
+      <w:pPr>
+        <w:numPr>
+          <w:ilvl w:val="0"/>
+          <w:numId w:val="11"/>
+        </w:numPr>
+      </w:pPr>
+      <w:r>
+        <w:t>Print the updated array.</w:t>
+      </w:r>
+    </w:p>
+    <w:p>
+      <w:r>
+        <w:t>Time Complexity</w:t>
+      </w:r>
+      <w:r>
+        <w:t xml:space="preserve"> </w:t>
+      </w:r>
+      <w:r>
+        <w:t>O(n)</w:t>
+      </w:r>
+    </w:p>
+    <w:p>
+      <w:r>
+        <w:t>Space Complexity</w:t>
+      </w:r>
+      <w:r>
+        <w:t xml:space="preserve"> </w:t>
+      </w:r>
+      <w:proofErr w:type="gramStart"/>
+      <w:r>
+        <w:t>O(</w:t>
+      </w:r>
+      <w:proofErr w:type="gramEnd"/>
+      <w:r>
+        <w:t>1)</w:t>
+      </w:r>
+    </w:p>
+    <w:p>
+      <w:pPr>
+        <w:rPr>
+          <w:b/>
+          <w:bCs/>
+        </w:rPr>
+      </w:pPr>
+      <w:r>
+        <w:rPr>
+          <w:b/>
+          <w:bCs/>
+        </w:rPr>
+        <w:t>3. Reverse an Array</w:t>
+      </w:r>
+    </w:p>
+    <w:p>
+      <w:pPr>
+        <w:rPr>
+          <w:b/>
+          <w:bCs/>
+        </w:rPr>
+      </w:pPr>
+      <w:r>
+        <w:rPr>
+          <w:b/>
+          <w:bCs/>
+        </w:rPr>
+        <w:t>Definition</w:t>
+      </w:r>
+    </w:p>
+    <w:p>
+      <w:r>
+        <w:t>Reversing an array means changing the order of the elements inside the same array.</w:t>
+      </w:r>
+    </w:p>
+    <w:p>
+      <w:pPr>
+        <w:rPr>
+          <w:b/>
+          <w:bCs/>
+        </w:rPr>
+      </w:pPr>
+      <w:r>
+        <w:rPr>
+          <w:b/>
+          <w:bCs/>
+        </w:rPr>
+        <w:t>Example</w:t>
+      </w:r>
+    </w:p>
+    <w:p>
+      <w:r>
+        <w:t>Before:</w:t>
+      </w:r>
+    </w:p>
+    <w:p>
+      <w:r>
+        <w:t>1 2 3 4 5</w:t>
+      </w:r>
+    </w:p>
+    <w:p>
+      <w:r>
+        <w:t>After:</w:t>
+      </w:r>
+    </w:p>
+    <w:p>
+      <w:r>
+        <w:t>5 4 3 2 1</w:t>
+      </w:r>
+    </w:p>
+    <w:p>
+      <w:pPr>
+        <w:rPr>
+          <w:b/>
+          <w:bCs/>
+        </w:rPr>
+      </w:pPr>
+      <w:r>
+        <w:rPr>
+          <w:b/>
+          <w:bCs/>
+        </w:rPr>
+        <w:lastRenderedPageBreak/>
+        <w:t>Two Pointer Technique</w:t>
+      </w:r>
+    </w:p>
+    <w:p>
+      <w:r>
+        <w:t>Use two pointers.</w:t>
+      </w:r>
+    </w:p>
+    <w:p>
+      <w:r>
+        <w:t>start = 0</w:t>
+      </w:r>
+    </w:p>
+    <w:p>
+      <w:r>
+        <w:t>end = last index</w:t>
+      </w:r>
+    </w:p>
+    <w:p>
+      <w:r>
+        <w:t>Swap</w:t>
+      </w:r>
+    </w:p>
+    <w:p>
+      <w:proofErr w:type="spellStart"/>
+      <w:r>
+        <w:t>arr</w:t>
+      </w:r>
+      <w:proofErr w:type="spellEnd"/>
+      <w:r>
+        <w:t xml:space="preserve">[start] ↔ </w:t>
+      </w:r>
+      <w:proofErr w:type="spellStart"/>
+      <w:r>
+        <w:t>arr</w:t>
+      </w:r>
+      <w:proofErr w:type="spellEnd"/>
+      <w:r>
+        <w:t>[end]</w:t>
+      </w:r>
+    </w:p>
+    <w:p>
+      <w:r>
+        <w:t>Move</w:t>
+      </w:r>
+    </w:p>
+    <w:p>
+      <w:r>
+        <w:t>start++</w:t>
+      </w:r>
+    </w:p>
+    <w:p>
+      <w:r>
+        <w:t>end</w:t>
+      </w:r>
+      <w:r>
+        <w:t>—</w:t>
+      </w:r>
+    </w:p>
+    <w:p>
+      <w:r>
+        <w:t>Repeat until</w:t>
+      </w:r>
+    </w:p>
+    <w:p>
+      <w:r>
+        <w:t>start &gt;= end</w:t>
+      </w:r>
+    </w:p>
+    <w:p>
+      <w:pPr>
+        <w:rPr>
+          <w:b/>
+          <w:bCs/>
+        </w:rPr>
+      </w:pPr>
+      <w:r>
+        <w:rPr>
+          <w:b/>
+          <w:bCs/>
+        </w:rPr>
+        <w:t>Time Complexity</w:t>
+      </w:r>
+    </w:p>
+    <w:p>
+      <w:r>
+        <w:t>O(n)</w:t>
+      </w:r>
+    </w:p>
+    <w:p>
+      <w:pPr>
+        <w:rPr>
+          <w:b/>
+          <w:bCs/>
+        </w:rPr>
+      </w:pPr>
+      <w:r>
+        <w:rPr>
+          <w:b/>
+          <w:bCs/>
+        </w:rPr>
+        <w:t>Space Complexity</w:t>
+      </w:r>
+    </w:p>
+    <w:p>
+      <w:proofErr w:type="gramStart"/>
+      <w:r>
+        <w:t>O(</w:t>
+      </w:r>
+      <w:proofErr w:type="gramEnd"/>
+      <w:r>
+        <w:t>1)</w:t>
+      </w:r>
+    </w:p>
+    <w:p>
+      <w:pPr>
+        <w:rPr>
+          <w:b/>
+          <w:bCs/>
+        </w:rPr>
+      </w:pPr>
+      <w:r>
+        <w:rPr>
+          <w:b/>
+          <w:bCs/>
+        </w:rPr>
+        <w:t>4. Two Pointer Technique</w:t>
+      </w:r>
+    </w:p>
+    <w:p>
+      <w:pPr>
+        <w:rPr>
+          <w:b/>
+          <w:bCs/>
+        </w:rPr>
+      </w:pPr>
+      <w:r>
+        <w:rPr>
+          <w:b/>
+          <w:bCs/>
+        </w:rPr>
+        <w:t>Definition</w:t>
+      </w:r>
+    </w:p>
+    <w:p>
+      <w:r>
+        <w:t>The Two Pointer Technique uses two indexes (or pointers) to solve problems efficiently.</w:t>
+      </w:r>
+    </w:p>
+    <w:p>
+      <w:proofErr w:type="gramStart"/>
+      <w:r>
+        <w:t>Usually</w:t>
+      </w:r>
+      <w:proofErr w:type="gramEnd"/>
+      <w:r>
+        <w:t xml:space="preserve"> one pointer starts from the beginning and the other from the end.</w:t>
+      </w:r>
+    </w:p>
+    <w:p>
+      <w:pPr>
+        <w:rPr>
+          <w:b/>
+          <w:bCs/>
+        </w:rPr>
+      </w:pPr>
+      <w:r>
+        <w:rPr>
+          <w:b/>
+          <w:bCs/>
+        </w:rPr>
+        <w:t>Applications</w:t>
+      </w:r>
+    </w:p>
+    <w:p>
+      <w:pPr>
+        <w:numPr>
+          <w:ilvl w:val="0"/>
+          <w:numId w:val="12"/>
+        </w:numPr>
+      </w:pPr>
+      <w:r>
+        <w:t xml:space="preserve">Reverse Array </w:t>
+      </w:r>
+    </w:p>
+    <w:p>
+      <w:pPr>
+        <w:numPr>
+          <w:ilvl w:val="0"/>
+          <w:numId w:val="12"/>
+        </w:numPr>
+      </w:pPr>
+      <w:r>
+        <w:t xml:space="preserve">Palindrome Checking </w:t>
+      </w:r>
+    </w:p>
+    <w:p>
+      <w:pPr>
+        <w:numPr>
+          <w:ilvl w:val="0"/>
+          <w:numId w:val="12"/>
+        </w:numPr>
+      </w:pPr>
+      <w:r>
+        <w:t xml:space="preserve">Two Sum (Sorted Array) </w:t>
+      </w:r>
+    </w:p>
+    <w:p>
+      <w:pPr>
+        <w:numPr>
+          <w:ilvl w:val="0"/>
+          <w:numId w:val="12"/>
+        </w:numPr>
+      </w:pPr>
+      <w:r>
+        <w:t xml:space="preserve">Remove Duplicates </w:t>
+      </w:r>
+    </w:p>
+    <w:p>
+      <w:pPr>
+        <w:numPr>
+          <w:ilvl w:val="0"/>
+          <w:numId w:val="12"/>
+        </w:numPr>
+      </w:pPr>
+      <w:r>
+        <w:t>Pair Sum Problems</w:t>
+      </w:r>
+    </w:p>
+    <w:p>
+      <w:pPr>
+        <w:rPr>
+          <w:b/>
+          <w:bCs/>
+        </w:rPr>
+      </w:pPr>
+      <w:r>
+        <w:rPr>
+          <w:b/>
+          <w:bCs/>
+        </w:rPr>
+        <w:t>Advantages</w:t>
+      </w:r>
+    </w:p>
+    <w:p>
+      <w:pPr>
+        <w:numPr>
+          <w:ilvl w:val="0"/>
+          <w:numId w:val="13"/>
+        </w:numPr>
+      </w:pPr>
+      <w:r>
+        <w:t xml:space="preserve">Reduces unnecessary iterations. </w:t>
+      </w:r>
+    </w:p>
+    <w:p>
+      <w:pPr>
+        <w:numPr>
+          <w:ilvl w:val="0"/>
+          <w:numId w:val="13"/>
+        </w:numPr>
+      </w:pPr>
+      <w:r>
+        <w:t xml:space="preserve">Improves performance. </w:t>
+      </w:r>
+    </w:p>
+    <w:p>
+      <w:pPr>
+        <w:numPr>
+          <w:ilvl w:val="0"/>
+          <w:numId w:val="13"/>
+        </w:numPr>
+      </w:pPr>
+      <w:r>
+        <w:lastRenderedPageBreak/>
+        <w:t xml:space="preserve">Uses constant extra space. </w:t>
+      </w:r>
+    </w:p>
+    <w:p>
+      <w:pPr>
+        <w:pStyle w:val="ListParagraph"/>
+        <w:numPr>
+          <w:ilvl w:val="0"/>
+          <w:numId w:val="11"/>
+        </w:numPr>
+      </w:pPr>
+      <w:r>
+        <w:rPr>
+          <w:rFonts w:ascii="Times New Roman" w:eastAsia="Times New Roman" w:hAnsi="Times New Roman" w:cs="Times New Roman"/>
+          <w:b/>
+          <w:bCs/>
+          <w:kern w:val="36"/>
+          <w:sz w:val="48"/>
+          <w:szCs w:val="48"/>
+          <w:lang w:eastAsia="en-IN"/>
+          <w14:ligatures w14:val="none"/>
+        </w:rPr>
+        <w:t>Second Largest Element</w:t>
+      </w:r>
+    </w:p>
+    <w:p>
+      <w:pPr>
+        <w:pStyle w:val="ListParagraph"/>
+      </w:pPr>
+      <w:r>
+        <w:rPr>
+          <w:rFonts w:ascii="Times New Roman" w:eastAsia="Times New Roman" w:hAnsi="Times New Roman" w:cs="Times New Roman"/>
+          <w:b/>
+          <w:bCs/>
+          <w:kern w:val="0"/>
+          <w:sz w:val="36"/>
+          <w:szCs w:val="36"/>
+          <w:lang w:eastAsia="en-IN"/>
+          <w14:ligatures w14:val="none"/>
+        </w:rPr>
+        <w:t>Definition</w:t>
+      </w:r>
+    </w:p>
+    <w:p>
+      <w:pPr>
+        <w:pStyle w:val="ListParagraph"/>
+        <w:numPr>
+          <w:ilvl w:val="0"/>
+          <w:numId w:val="13"/>
+        </w:numPr>
+        <w:spacing w:before="100" w:beforeAutospacing="1" w:after="100" w:afterAutospacing="1" w:line="240" w:lineRule="auto"/>
+        <w:rPr>
+          <w:rFonts w:ascii="Times New Roman" w:eastAsia="Times New Roman" w:hAnsi="Times New Roman" w:cs="Times New Roman"/>
+          <w:kern w:val="0"/>
+          <w:lang w:eastAsia="en-IN"/>
+          <w14:ligatures w14:val="none"/>
+        </w:rPr>
+      </w:pPr>
+      <w:r>
+        <w:rPr>
+          <w:rFonts w:ascii="Times New Roman" w:eastAsia="Times New Roman" w:hAnsi="Times New Roman" w:cs="Times New Roman"/>
+          <w:kern w:val="0"/>
+          <w:lang w:eastAsia="en-IN"/>
+          <w14:ligatures w14:val="none"/>
+        </w:rPr>
+        <w:t xml:space="preserve">The </w:t>
+      </w:r>
+      <w:r>
+        <w:rPr>
+          <w:rFonts w:ascii="Times New Roman" w:eastAsia="Times New Roman" w:hAnsi="Times New Roman" w:cs="Times New Roman"/>
+          <w:b/>
+          <w:bCs/>
+          <w:kern w:val="0"/>
+          <w:lang w:eastAsia="en-IN"/>
+          <w14:ligatures w14:val="none"/>
+        </w:rPr>
+        <w:t>second largest element</w:t>
+      </w:r>
+      <w:r>
+        <w:rPr>
+          <w:rFonts w:ascii="Times New Roman" w:eastAsia="Times New Roman" w:hAnsi="Times New Roman" w:cs="Times New Roman"/>
+          <w:kern w:val="0"/>
+          <w:lang w:eastAsia="en-IN"/>
+          <w14:ligatures w14:val="none"/>
+        </w:rPr>
+        <w:t xml:space="preserve"> is the largest value after the maximum element.</w:t>
+      </w:r>
+    </w:p>
+    <w:p>
+      <w:pPr>
+        <w:pStyle w:val="ListParagraph"/>
+        <w:spacing w:before="100" w:beforeAutospacing="1" w:after="100" w:afterAutospacing="1" w:line="240" w:lineRule="auto"/>
+        <w:rPr>
+          <w:rFonts w:ascii="Times New Roman" w:eastAsia="Times New Roman" w:hAnsi="Times New Roman" w:cs="Times New Roman"/>
+          <w:kern w:val="0"/>
+          <w:lang w:eastAsia="en-IN"/>
+          <w14:ligatures w14:val="none"/>
+        </w:rPr>
+      </w:pPr>
+      <w:r>
+        <w:rPr>
+          <w:rFonts w:ascii="Times New Roman" w:eastAsia="Times New Roman" w:hAnsi="Times New Roman" w:cs="Times New Roman"/>
+          <w:kern w:val="0"/>
+          <w:lang w:eastAsia="en-IN"/>
+          <w14:ligatures w14:val="none"/>
+        </w:rPr>
+        <w:t>Example</w:t>
+      </w:r>
+    </w:p>
+    <w:p>
+      <w:pPr>
+        <w:pStyle w:val="ListParagraph"/>
+        <w:spacing w:before="100" w:beforeAutospacing="1" w:after="100" w:afterAutospacing="1" w:line="240" w:lineRule="auto"/>
+        <w:rPr>
+          <w:rFonts w:ascii="Times New Roman" w:eastAsia="Times New Roman" w:hAnsi="Times New Roman" w:cs="Times New Roman"/>
+          <w:kern w:val="0"/>
+          <w:lang w:eastAsia="en-IN"/>
+          <w14:ligatures w14:val="none"/>
+        </w:rPr>
+      </w:pPr>
+    </w:p>
+    <w:p>
+      <w:pPr>
+        <w:pStyle w:val="ListParagraph"/>
+        <w:spacing w:before="100" w:beforeAutospacing="1" w:after="100" w:afterAutospacing="1" w:line="240" w:lineRule="auto"/>
+        <w:rPr>
+          <w:rFonts w:ascii="Times New Roman" w:eastAsia="Times New Roman" w:hAnsi="Times New Roman" w:cs="Times New Roman"/>
+          <w:kern w:val="0"/>
+          <w:lang w:eastAsia="en-IN"/>
+          <w14:ligatures w14:val="none"/>
+        </w:rPr>
+      </w:pPr>
+      <w:r>
+        <w:rPr>
+          <w:rFonts w:ascii="Times New Roman" w:eastAsia="Times New Roman" w:hAnsi="Times New Roman" w:cs="Times New Roman"/>
+          <w:kern w:val="0"/>
+          <w:lang w:eastAsia="en-IN"/>
+          <w14:ligatures w14:val="none"/>
+        </w:rPr>
+        <w:t>10 45 20 80 30</w:t>
+      </w:r>
+    </w:p>
+    <w:p>
+      <w:pPr>
+        <w:pStyle w:val="ListParagraph"/>
+        <w:spacing w:before="100" w:beforeAutospacing="1" w:after="100" w:afterAutospacing="1" w:line="240" w:lineRule="auto"/>
+        <w:rPr>
+          <w:rFonts w:ascii="Times New Roman" w:eastAsia="Times New Roman" w:hAnsi="Times New Roman" w:cs="Times New Roman"/>
+          <w:kern w:val="0"/>
+          <w:lang w:eastAsia="en-IN"/>
+          <w14:ligatures w14:val="none"/>
+        </w:rPr>
+      </w:pPr>
+    </w:p>
+    <w:p>
+      <w:pPr>
+        <w:pStyle w:val="ListParagraph"/>
+        <w:spacing w:before="100" w:beforeAutospacing="1" w:after="100" w:afterAutospacing="1" w:line="240" w:lineRule="auto"/>
+        <w:rPr>
+          <w:rFonts w:ascii="Times New Roman" w:eastAsia="Times New Roman" w:hAnsi="Times New Roman" w:cs="Times New Roman"/>
+          <w:kern w:val="0"/>
+          <w:lang w:eastAsia="en-IN"/>
+          <w14:ligatures w14:val="none"/>
+        </w:rPr>
+      </w:pPr>
+      <w:r>
+        <w:rPr>
+          <w:rFonts w:ascii="Times New Roman" w:eastAsia="Times New Roman" w:hAnsi="Times New Roman" w:cs="Times New Roman"/>
+          <w:kern w:val="0"/>
+          <w:lang w:eastAsia="en-IN"/>
+          <w14:ligatures w14:val="none"/>
+        </w:rPr>
+        <w:t>Largest</w:t>
+      </w:r>
+    </w:p>
+    <w:p>
+      <w:pPr>
+        <w:pStyle w:val="ListParagraph"/>
+        <w:spacing w:before="100" w:beforeAutospacing="1" w:after="100" w:afterAutospacing="1" w:line="240" w:lineRule="auto"/>
+        <w:rPr>
+          <w:rFonts w:ascii="Times New Roman" w:eastAsia="Times New Roman" w:hAnsi="Times New Roman" w:cs="Times New Roman"/>
+          <w:kern w:val="0"/>
+          <w:lang w:eastAsia="en-IN"/>
+          <w14:ligatures w14:val="none"/>
+        </w:rPr>
+      </w:pPr>
+      <w:r>
+        <w:rPr>
+          <w:rFonts w:ascii="Times New Roman" w:eastAsia="Times New Roman" w:hAnsi="Times New Roman" w:cs="Times New Roman"/>
+          <w:kern w:val="0"/>
+          <w:lang w:eastAsia="en-IN"/>
+          <w14:ligatures w14:val="none"/>
+        </w:rPr>
+        <w:t>80</w:t>
+      </w:r>
+    </w:p>
+    <w:p>
+      <w:pPr>
+        <w:pStyle w:val="ListParagraph"/>
+        <w:spacing w:before="100" w:beforeAutospacing="1" w:after="100" w:afterAutospacing="1" w:line="240" w:lineRule="auto"/>
+        <w:rPr>
+          <w:rFonts w:ascii="Times New Roman" w:eastAsia="Times New Roman" w:hAnsi="Times New Roman" w:cs="Times New Roman"/>
+          <w:kern w:val="0"/>
+          <w:lang w:eastAsia="en-IN"/>
+          <w14:ligatures w14:val="none"/>
+        </w:rPr>
+      </w:pPr>
+    </w:p>
+    <w:p>
+      <w:pPr>
+        <w:pStyle w:val="ListParagraph"/>
+        <w:spacing w:before="100" w:beforeAutospacing="1" w:after="100" w:afterAutospacing="1" w:line="240" w:lineRule="auto"/>
+        <w:rPr>
+          <w:rFonts w:ascii="Times New Roman" w:eastAsia="Times New Roman" w:hAnsi="Times New Roman" w:cs="Times New Roman"/>
+          <w:kern w:val="0"/>
+          <w:lang w:eastAsia="en-IN"/>
+          <w14:ligatures w14:val="none"/>
+        </w:rPr>
+      </w:pPr>
+      <w:proofErr w:type="spellStart"/>
+      <w:r>
+        <w:rPr>
+          <w:rFonts w:ascii="Times New Roman" w:eastAsia="Times New Roman" w:hAnsi="Times New Roman" w:cs="Times New Roman"/>
+          <w:kern w:val="0"/>
+          <w:lang w:eastAsia="en-IN"/>
+          <w14:ligatures w14:val="none"/>
+        </w:rPr>
+        <w:t>SecondLargest</w:t>
+      </w:r>
+      <w:proofErr w:type="spellEnd"/>
+    </w:p>
+    <w:p>
+      <w:pPr>
+        <w:pStyle w:val="ListParagraph"/>
+        <w:spacing w:before="100" w:beforeAutospacing="1" w:after="100" w:afterAutospacing="1" w:line="240" w:lineRule="auto"/>
+        <w:rPr>
+          <w:rFonts w:ascii="Times New Roman" w:eastAsia="Times New Roman" w:hAnsi="Times New Roman" w:cs="Times New Roman"/>
+          <w:kern w:val="0"/>
+          <w:lang w:eastAsia="en-IN"/>
+          <w14:ligatures w14:val="none"/>
+        </w:rPr>
+      </w:pPr>
+      <w:r>
+        <w:rPr>
+          <w:rFonts w:ascii="Times New Roman" w:eastAsia="Times New Roman" w:hAnsi="Times New Roman" w:cs="Times New Roman"/>
+          <w:kern w:val="0"/>
+          <w:lang w:eastAsia="en-IN"/>
+          <w14:ligatures w14:val="none"/>
+        </w:rPr>
+        <w:t>45</w:t>
+      </w:r>
+    </w:p>
+    <w:p>
+      <w:pPr>
+        <w:pStyle w:val="ListParagraph"/>
+        <w:spacing w:before="100" w:beforeAutospacing="1" w:after="100" w:afterAutospacing="1" w:line="240" w:lineRule="auto"/>
+        <w:rPr>
+          <w:rFonts w:ascii="Times New Roman" w:eastAsia="Times New Roman" w:hAnsi="Times New Roman" w:cs="Times New Roman"/>
+          <w:kern w:val="0"/>
+          <w:lang w:eastAsia="en-IN"/>
+          <w14:ligatures w14:val="none"/>
+        </w:rPr>
+      </w:pPr>
+    </w:p>
+    <w:p>
+      <w:pPr>
+        <w:pStyle w:val="ListParagraph"/>
+        <w:rPr>
+          <w:rFonts w:ascii="Times New Roman" w:eastAsia="Times New Roman" w:hAnsi="Times New Roman" w:cs="Times New Roman"/>
+          <w:b/>
+          <w:bCs/>
+          <w:kern w:val="0"/>
+          <w:lang w:eastAsia="en-IN"/>
+          <w14:ligatures w14:val="none"/>
+        </w:rPr>
+      </w:pPr>
+      <w:r>
+        <w:rPr>
+          <w:rFonts w:ascii="Times New Roman" w:eastAsia="Times New Roman" w:hAnsi="Times New Roman" w:cs="Times New Roman"/>
+          <w:b/>
+          <w:bCs/>
+          <w:kern w:val="0"/>
+          <w:lang w:eastAsia="en-IN"/>
+          <w14:ligatures w14:val="none"/>
+        </w:rPr>
+        <w:t>Logic</w:t>
+      </w:r>
+    </w:p>
+    <w:p>
+      <w:pPr>
+        <w:pStyle w:val="ListParagraph"/>
+        <w:rPr>
+          <w:rFonts w:ascii="Times New Roman" w:eastAsia="Times New Roman" w:hAnsi="Times New Roman" w:cs="Times New Roman"/>
+          <w:kern w:val="0"/>
+          <w:lang w:eastAsia="en-IN"/>
+          <w14:ligatures w14:val="none"/>
+        </w:rPr>
+      </w:pPr>
+      <w:r>
+        <w:rPr>
+          <w:rFonts w:ascii="Times New Roman" w:eastAsia="Times New Roman" w:hAnsi="Times New Roman" w:cs="Times New Roman"/>
+          <w:kern w:val="0"/>
+          <w:lang w:eastAsia="en-IN"/>
+          <w14:ligatures w14:val="none"/>
+        </w:rPr>
+        <w:t>Maintain two variables:</w:t>
+      </w:r>
+    </w:p>
+    <w:p>
+      <w:pPr>
+        <w:pStyle w:val="ListParagraph"/>
+        <w:spacing w:before="100" w:beforeAutospacing="1" w:after="100" w:afterAutospacing="1" w:line="240" w:lineRule="auto"/>
+        <w:rPr>
+          <w:rFonts w:ascii="Times New Roman" w:eastAsia="Times New Roman" w:hAnsi="Times New Roman" w:cs="Times New Roman"/>
+          <w:kern w:val="0"/>
+          <w:lang w:eastAsia="en-IN"/>
+          <w14:ligatures w14:val="none"/>
+        </w:rPr>
+      </w:pPr>
+    </w:p>
+    <w:p>
+      <w:pPr>
+        <w:pStyle w:val="ListParagraph"/>
+        <w:spacing w:before="100" w:beforeAutospacing="1" w:after="100" w:afterAutospacing="1" w:line="240" w:lineRule="auto"/>
+        <w:rPr>
+          <w:rFonts w:ascii="Times New Roman" w:eastAsia="Times New Roman" w:hAnsi="Times New Roman" w:cs="Times New Roman"/>
+          <w:kern w:val="0"/>
+          <w:lang w:eastAsia="en-IN"/>
+          <w14:ligatures w14:val="none"/>
+        </w:rPr>
+      </w:pPr>
+      <w:r>
+        <w:rPr>
+          <w:rFonts w:ascii="Times New Roman" w:eastAsia="Times New Roman" w:hAnsi="Times New Roman" w:cs="Times New Roman"/>
+          <w:kern w:val="0"/>
+          <w:lang w:eastAsia="en-IN"/>
+          <w14:ligatures w14:val="none"/>
+        </w:rPr>
+        <w:t>largest</w:t>
+      </w:r>
+    </w:p>
+    <w:p>
+      <w:pPr>
+        <w:pStyle w:val="ListParagraph"/>
+        <w:spacing w:before="100" w:beforeAutospacing="1" w:after="100" w:afterAutospacing="1" w:line="240" w:lineRule="auto"/>
+        <w:rPr>
+          <w:rFonts w:ascii="Times New Roman" w:eastAsia="Times New Roman" w:hAnsi="Times New Roman" w:cs="Times New Roman"/>
+          <w:kern w:val="0"/>
+          <w:lang w:eastAsia="en-IN"/>
+          <w14:ligatures w14:val="none"/>
+        </w:rPr>
+      </w:pPr>
+      <w:proofErr w:type="spellStart"/>
+      <w:r>
+        <w:rPr>
+          <w:rFonts w:ascii="Times New Roman" w:eastAsia="Times New Roman" w:hAnsi="Times New Roman" w:cs="Times New Roman"/>
+          <w:kern w:val="0"/>
+          <w:lang w:eastAsia="en-IN"/>
+          <w14:ligatures w14:val="none"/>
+        </w:rPr>
+        <w:t>secondLargest</w:t>
+      </w:r>
+      <w:proofErr w:type="spellEnd"/>
+    </w:p>
+    <w:p>
+      <w:pPr>
+        <w:pStyle w:val="ListParagraph"/>
+        <w:spacing w:before="100" w:beforeAutospacing="1" w:after="100" w:afterAutospacing="1" w:line="240" w:lineRule="auto"/>
+        <w:rPr>
+          <w:rFonts w:ascii="Times New Roman" w:eastAsia="Times New Roman" w:hAnsi="Times New Roman" w:cs="Times New Roman"/>
+          <w:kern w:val="0"/>
+          <w:lang w:eastAsia="en-IN"/>
+          <w14:ligatures w14:val="none"/>
+        </w:rPr>
+      </w:pPr>
+    </w:p>
+    <w:p>
+      <w:pPr>
+        <w:pStyle w:val="ListParagraph"/>
+        <w:spacing w:before="100" w:beforeAutospacing="1" w:after="100" w:afterAutospacing="1" w:line="240" w:lineRule="auto"/>
+        <w:rPr>
+          <w:rFonts w:ascii="Times New Roman" w:eastAsia="Times New Roman" w:hAnsi="Times New Roman" w:cs="Times New Roman"/>
+          <w:kern w:val="0"/>
+          <w:lang w:eastAsia="en-IN"/>
+          <w14:ligatures w14:val="none"/>
+        </w:rPr>
+      </w:pPr>
+      <w:r>
+        <w:rPr>
+          <w:rFonts w:ascii="Times New Roman" w:eastAsia="Times New Roman" w:hAnsi="Times New Roman" w:cs="Times New Roman"/>
+          <w:kern w:val="0"/>
+          <w:lang w:eastAsia="en-IN"/>
+          <w14:ligatures w14:val="none"/>
+        </w:rPr>
+        <w:t>Traverse the array once and update these variables whenever a larger value is found.</w:t>
+      </w:r>
+    </w:p>
+    <w:p>
+      <w:pPr>
+        <w:pStyle w:val="ListParagraph"/>
+        <w:spacing w:before="100" w:beforeAutospacing="1" w:after="100" w:afterAutospacing="1" w:line="240" w:lineRule="auto"/>
+        <w:rPr>
+          <w:rFonts w:ascii="Times New Roman" w:eastAsia="Times New Roman" w:hAnsi="Times New Roman" w:cs="Times New Roman"/>
+          <w:kern w:val="0"/>
+          <w:lang w:eastAsia="en-IN"/>
+          <w14:ligatures w14:val="none"/>
+        </w:rPr>
+      </w:pPr>
+    </w:p>
+    <w:p>
+      <w:pPr>
+        <w:pStyle w:val="ListParagraph"/>
+        <w:spacing w:before="100" w:beforeAutospacing="1" w:after="100" w:afterAutospacing="1" w:line="240" w:lineRule="auto"/>
+        <w:rPr>
+          <w:rFonts w:ascii="Times New Roman" w:eastAsia="Times New Roman" w:hAnsi="Times New Roman" w:cs="Times New Roman"/>
+          <w:kern w:val="0"/>
+          <w:lang w:eastAsia="en-IN"/>
+          <w14:ligatures w14:val="none"/>
+        </w:rPr>
+      </w:pPr>
+      <w:r>
+        <w:rPr>
+          <w:rFonts w:ascii="Times New Roman" w:eastAsia="Times New Roman" w:hAnsi="Times New Roman" w:cs="Times New Roman"/>
+          <w:kern w:val="0"/>
+          <w:lang w:eastAsia="en-IN"/>
+          <w14:ligatures w14:val="none"/>
+        </w:rPr>
+        <w:t>Time Complexity</w:t>
+      </w:r>
+    </w:p>
+    <w:p>
+      <w:pPr>
+        <w:pStyle w:val="ListParagraph"/>
+        <w:spacing w:before="100" w:beforeAutospacing="1" w:after="100" w:afterAutospacing="1" w:line="240" w:lineRule="auto"/>
+        <w:rPr>
+          <w:rFonts w:ascii="Times New Roman" w:eastAsia="Times New Roman" w:hAnsi="Times New Roman" w:cs="Times New Roman"/>
+          <w:kern w:val="0"/>
+          <w:lang w:eastAsia="en-IN"/>
+          <w14:ligatures w14:val="none"/>
+        </w:rPr>
+      </w:pPr>
+      <w:r>
+        <w:rPr>
+          <w:rFonts w:ascii="Times New Roman" w:eastAsia="Times New Roman" w:hAnsi="Times New Roman" w:cs="Times New Roman"/>
+          <w:kern w:val="0"/>
+          <w:lang w:eastAsia="en-IN"/>
+          <w14:ligatures w14:val="none"/>
+        </w:rPr>
+        <w:t>O(n)</w:t>
+      </w:r>
+    </w:p>
+    <w:p>
+      <w:pPr>
+        <w:pStyle w:val="ListParagraph"/>
+        <w:spacing w:before="100" w:beforeAutospacing="1" w:after="100" w:afterAutospacing="1" w:line="240" w:lineRule="auto"/>
+        <w:rPr>
+          <w:rFonts w:ascii="Times New Roman" w:eastAsia="Times New Roman" w:hAnsi="Times New Roman" w:cs="Times New Roman"/>
+          <w:kern w:val="0"/>
+          <w:lang w:eastAsia="en-IN"/>
+          <w14:ligatures w14:val="none"/>
+        </w:rPr>
+      </w:pPr>
+      <w:r>
+        <w:rPr>
+          <w:rFonts w:ascii="Times New Roman" w:eastAsia="Times New Roman" w:hAnsi="Times New Roman" w:cs="Times New Roman"/>
+          <w:kern w:val="0"/>
+          <w:lang w:eastAsia="en-IN"/>
+          <w14:ligatures w14:val="none"/>
+        </w:rPr>
+        <w:t>Space Complexity</w:t>
+      </w:r>
+    </w:p>
+    <w:p>
+      <w:pPr>
+        <w:pStyle w:val="ListParagraph"/>
+        <w:spacing w:before="100" w:beforeAutospacing="1" w:after="100" w:afterAutospacing="1" w:line="240" w:lineRule="auto"/>
+        <w:rPr>
+          <w:rFonts w:ascii="Times New Roman" w:eastAsia="Times New Roman" w:hAnsi="Times New Roman" w:cs="Times New Roman"/>
+          <w:kern w:val="0"/>
+          <w:lang w:eastAsia="en-IN"/>
+          <w14:ligatures w14:val="none"/>
+        </w:rPr>
+      </w:pPr>
+      <w:proofErr w:type="gramStart"/>
+      <w:r>
+        <w:rPr>
+          <w:rFonts w:ascii="Times New Roman" w:eastAsia="Times New Roman" w:hAnsi="Times New Roman" w:cs="Times New Roman"/>
+          <w:kern w:val="0"/>
+          <w:lang w:eastAsia="en-IN"/>
+          <w14:ligatures w14:val="none"/>
+        </w:rPr>
+        <w:t>O(</w:t>
+      </w:r>
+      <w:proofErr w:type="gramEnd"/>
+      <w:r>
+        <w:rPr>
+          <w:rFonts w:ascii="Times New Roman" w:eastAsia="Times New Roman" w:hAnsi="Times New Roman" w:cs="Times New Roman"/>
+          <w:kern w:val="0"/>
+          <w:lang w:eastAsia="en-IN"/>
+          <w14:ligatures w14:val="none"/>
+        </w:rPr>
+        <w:t>1)</w:t>
+      </w:r>
+    </w:p>
+    <w:p>
+      <w:pPr>
+        <w:pStyle w:val="ListParagraph"/>
+        <w:spacing w:before="100" w:beforeAutospacing="1" w:after="100" w:afterAutospacing="1" w:line="240" w:lineRule="auto"/>
+        <w:rPr>
+          <w:rFonts w:ascii="Times New Roman" w:eastAsia="Times New Roman" w:hAnsi="Times New Roman" w:cs="Times New Roman"/>
+          <w:kern w:val="0"/>
+          <w:lang w:eastAsia="en-IN"/>
+          <w14:ligatures w14:val="none"/>
+        </w:rPr>
+      </w:pPr>
+    </w:p>
+    <w:p>
+      <w:pPr>
+        <w:pStyle w:val="ListParagraph"/>
+        <w:rPr>
+          <w:rFonts w:ascii="Times New Roman" w:eastAsia="Times New Roman" w:hAnsi="Times New Roman" w:cs="Times New Roman"/>
+          <w:b/>
+          <w:bCs/>
+          <w:kern w:val="0"/>
+          <w:lang w:eastAsia="en-IN"/>
+          <w14:ligatures w14:val="none"/>
+        </w:rPr>
+      </w:pPr>
+      <w:r>
+        <w:rPr>
+          <w:rFonts w:ascii="Times New Roman" w:eastAsia="Times New Roman" w:hAnsi="Times New Roman" w:cs="Times New Roman"/>
+          <w:b/>
+          <w:bCs/>
+          <w:kern w:val="0"/>
+          <w:lang w:eastAsia="en-IN"/>
+          <w14:ligatures w14:val="none"/>
+        </w:rPr>
+        <w:t>6. Why are Array Insertion and Deletion Costly?</w:t>
+      </w:r>
+    </w:p>
+    <w:p>
+      <w:pPr>
+        <w:pStyle w:val="ListParagraph"/>
+        <w:rPr>
+          <w:rFonts w:ascii="Times New Roman" w:eastAsia="Times New Roman" w:hAnsi="Times New Roman" w:cs="Times New Roman"/>
+          <w:kern w:val="0"/>
+          <w:lang w:eastAsia="en-IN"/>
+          <w14:ligatures w14:val="none"/>
+        </w:rPr>
+      </w:pPr>
+      <w:r>
+        <w:rPr>
+          <w:rFonts w:ascii="Times New Roman" w:eastAsia="Times New Roman" w:hAnsi="Times New Roman" w:cs="Times New Roman"/>
+          <w:kern w:val="0"/>
+          <w:lang w:eastAsia="en-IN"/>
+          <w14:ligatures w14:val="none"/>
+        </w:rPr>
+        <w:t xml:space="preserve">Arrays store elements in </w:t>
+      </w:r>
+      <w:r>
+        <w:rPr>
+          <w:rFonts w:ascii="Times New Roman" w:eastAsia="Times New Roman" w:hAnsi="Times New Roman" w:cs="Times New Roman"/>
+          <w:b/>
+          <w:bCs/>
+          <w:kern w:val="0"/>
+          <w:lang w:eastAsia="en-IN"/>
+          <w14:ligatures w14:val="none"/>
+        </w:rPr>
+        <w:t>contiguous memory locations</w:t>
+      </w:r>
+      <w:r>
+        <w:rPr>
+          <w:rFonts w:ascii="Times New Roman" w:eastAsia="Times New Roman" w:hAnsi="Times New Roman" w:cs="Times New Roman"/>
+          <w:kern w:val="0"/>
+          <w:lang w:eastAsia="en-IN"/>
+          <w14:ligatures w14:val="none"/>
+        </w:rPr>
+        <w:t>.</w:t>
+      </w:r>
+    </w:p>
+    <w:p>
+      <w:pPr>
+        <w:pStyle w:val="ListParagraph"/>
+        <w:rPr>
+          <w:rFonts w:ascii="Times New Roman" w:eastAsia="Times New Roman" w:hAnsi="Times New Roman" w:cs="Times New Roman"/>
+          <w:kern w:val="0"/>
+          <w:lang w:eastAsia="en-IN"/>
+          <w14:ligatures w14:val="none"/>
+        </w:rPr>
+      </w:pPr>
+      <w:r>
+        <w:rPr>
+          <w:rFonts w:ascii="Times New Roman" w:eastAsia="Times New Roman" w:hAnsi="Times New Roman" w:cs="Times New Roman"/>
+          <w:kern w:val="0"/>
+          <w:lang w:eastAsia="en-IN"/>
+          <w14:ligatures w14:val="none"/>
+        </w:rPr>
+        <w:t>When inserting or deleting an element, the remaining elements often need to be shifted.</w:t>
+      </w:r>
+    </w:p>
+    <w:p>
+      <w:pPr>
+        <w:pStyle w:val="ListParagraph"/>
+        <w:rPr>
+          <w:rFonts w:ascii="Times New Roman" w:eastAsia="Times New Roman" w:hAnsi="Times New Roman" w:cs="Times New Roman"/>
+          <w:b/>
+          <w:bCs/>
+          <w:kern w:val="0"/>
+          <w:lang w:eastAsia="en-IN"/>
+          <w14:ligatures w14:val="none"/>
+        </w:rPr>
+      </w:pPr>
+      <w:r>
+        <w:rPr>
+          <w:rFonts w:ascii="Times New Roman" w:eastAsia="Times New Roman" w:hAnsi="Times New Roman" w:cs="Times New Roman"/>
+          <w:b/>
+          <w:bCs/>
+          <w:kern w:val="0"/>
+          <w:lang w:eastAsia="en-IN"/>
+          <w14:ligatures w14:val="none"/>
+        </w:rPr>
+        <w:t>Example</w:t>
+      </w:r>
+    </w:p>
+    <w:p>
+      <w:pPr>
+        <w:pStyle w:val="ListParagraph"/>
+        <w:spacing w:before="100" w:beforeAutospacing="1" w:after="100" w:afterAutospacing="1" w:line="240" w:lineRule="auto"/>
+        <w:rPr>
+          <w:rFonts w:ascii="Times New Roman" w:eastAsia="Times New Roman" w:hAnsi="Times New Roman" w:cs="Times New Roman"/>
+          <w:kern w:val="0"/>
+          <w:lang w:eastAsia="en-IN"/>
+          <w14:ligatures w14:val="none"/>
+        </w:rPr>
+      </w:pPr>
+      <w:r>
+        <w:rPr>
+          <w:rFonts w:ascii="Times New Roman" w:eastAsia="Times New Roman" w:hAnsi="Times New Roman" w:cs="Times New Roman"/>
+          <w:kern w:val="0"/>
+          <w:lang w:eastAsia="en-IN"/>
+          <w14:ligatures w14:val="none"/>
+        </w:rPr>
+        <w:t>10 20 30 40 50</w:t>
+      </w:r>
+    </w:p>
+    <w:p>
+      <w:pPr>
+        <w:pStyle w:val="ListParagraph"/>
+        <w:spacing w:before="100" w:beforeAutospacing="1" w:after="100" w:afterAutospacing="1" w:line="240" w:lineRule="auto"/>
+        <w:rPr>
+          <w:rFonts w:ascii="Times New Roman" w:eastAsia="Times New Roman" w:hAnsi="Times New Roman" w:cs="Times New Roman"/>
+          <w:b/>
+          <w:bCs/>
+          <w:kern w:val="0"/>
+          <w:lang w:eastAsia="en-IN"/>
+          <w14:ligatures w14:val="none"/>
+        </w:rPr>
+      </w:pPr>
+      <w:r>
+        <w:rPr>
+          <w:rFonts w:ascii="Times New Roman" w:eastAsia="Times New Roman" w:hAnsi="Times New Roman" w:cs="Times New Roman"/>
+          <w:kern w:val="0"/>
+          <w:lang w:eastAsia="en-IN"/>
+          <w14:ligatures w14:val="none"/>
+        </w:rPr>
+        <w:t xml:space="preserve">Insert </w:t>
+      </w:r>
+      <w:r>
+        <w:rPr>
+          <w:rFonts w:ascii="Times New Roman" w:eastAsia="Times New Roman" w:hAnsi="Times New Roman" w:cs="Times New Roman"/>
+          <w:b/>
+          <w:bCs/>
+          <w:kern w:val="0"/>
+          <w:lang w:eastAsia="en-IN"/>
+          <w14:ligatures w14:val="none"/>
+        </w:rPr>
+        <w:t>15</w:t>
+      </w:r>
+    </w:p>
+    <w:p>
+      <w:pPr>
+        <w:pStyle w:val="ListParagraph"/>
+        <w:spacing w:before="100" w:beforeAutospacing="1" w:after="100" w:afterAutospacing="1" w:line="240" w:lineRule="auto"/>
+        <w:rPr>
+          <w:rFonts w:ascii="Times New Roman" w:eastAsia="Times New Roman" w:hAnsi="Times New Roman" w:cs="Times New Roman"/>
+          <w:kern w:val="0"/>
+          <w:lang w:eastAsia="en-IN"/>
+          <w14:ligatures w14:val="none"/>
+        </w:rPr>
+      </w:pPr>
+      <w:r>
+        <w:rPr>
+          <w:rFonts w:ascii="Times New Roman" w:eastAsia="Times New Roman" w:hAnsi="Times New Roman" w:cs="Times New Roman"/>
+          <w:kern w:val="0"/>
+          <w:lang w:eastAsia="en-IN"/>
+          <w14:ligatures w14:val="none"/>
+        </w:rPr>
+        <w:t>10 15 20 30 40 50</w:t>
+      </w:r>
+    </w:p>
+    <w:p>
+      <w:pPr>
+        <w:pStyle w:val="ListParagraph"/>
+        <w:spacing w:before="100" w:beforeAutospacing="1" w:after="100" w:afterAutospacing="1" w:line="240" w:lineRule="auto"/>
+        <w:rPr>
+          <w:rFonts w:ascii="Times New Roman" w:eastAsia="Times New Roman" w:hAnsi="Times New Roman" w:cs="Times New Roman"/>
+          <w:kern w:val="0"/>
+          <w:lang w:eastAsia="en-IN"/>
+          <w14:ligatures w14:val="none"/>
+        </w:rPr>
+      </w:pPr>
+    </w:p>
+    <w:p>
+      <w:pPr>
+        <w:pStyle w:val="ListParagraph"/>
+        <w:spacing w:before="100" w:beforeAutospacing="1" w:after="100" w:afterAutospacing="1" w:line="240" w:lineRule="auto"/>
+        <w:rPr>
+          <w:rFonts w:ascii="Times New Roman" w:eastAsia="Times New Roman" w:hAnsi="Times New Roman" w:cs="Times New Roman"/>
+          <w:kern w:val="0"/>
+          <w:lang w:eastAsia="en-IN"/>
+          <w14:ligatures w14:val="none"/>
+        </w:rPr>
+      </w:pPr>
+      <w:r>
+        <w:rPr>
+          <w:rFonts w:ascii="Times New Roman" w:eastAsia="Times New Roman" w:hAnsi="Times New Roman" w:cs="Times New Roman"/>
+          <w:kern w:val="0"/>
+          <w:lang w:eastAsia="en-IN"/>
+          <w14:ligatures w14:val="none"/>
+        </w:rPr>
+        <w:t>Elements Shifted</w:t>
+      </w:r>
+    </w:p>
+    <w:p>
+      <w:pPr>
+        <w:pStyle w:val="ListParagraph"/>
+        <w:spacing w:before="100" w:beforeAutospacing="1" w:after="100" w:afterAutospacing="1" w:line="240" w:lineRule="auto"/>
+        <w:rPr>
+          <w:rFonts w:ascii="Times New Roman" w:eastAsia="Times New Roman" w:hAnsi="Times New Roman" w:cs="Times New Roman"/>
+          <w:kern w:val="0"/>
+          <w:lang w:eastAsia="en-IN"/>
+          <w14:ligatures w14:val="none"/>
+        </w:rPr>
+      </w:pPr>
+      <w:r>
+        <w:rPr>
+          <w:rFonts w:ascii="Times New Roman" w:eastAsia="Times New Roman" w:hAnsi="Times New Roman" w:cs="Times New Roman"/>
+          <w:kern w:val="0"/>
+          <w:lang w:eastAsia="en-IN"/>
+          <w14:ligatures w14:val="none"/>
+        </w:rPr>
+        <w:t>20</w:t>
+      </w:r>
+    </w:p>
+    <w:p>
+      <w:pPr>
+        <w:pStyle w:val="ListParagraph"/>
+        <w:spacing w:before="100" w:beforeAutospacing="1" w:after="100" w:afterAutospacing="1" w:line="240" w:lineRule="auto"/>
+        <w:rPr>
+          <w:rFonts w:ascii="Times New Roman" w:eastAsia="Times New Roman" w:hAnsi="Times New Roman" w:cs="Times New Roman"/>
+          <w:kern w:val="0"/>
+          <w:lang w:eastAsia="en-IN"/>
+          <w14:ligatures w14:val="none"/>
+        </w:rPr>
+      </w:pPr>
+      <w:r>
+        <w:rPr>
+          <w:rFonts w:ascii="Times New Roman" w:eastAsia="Times New Roman" w:hAnsi="Times New Roman" w:cs="Times New Roman"/>
+          <w:kern w:val="0"/>
+          <w:lang w:eastAsia="en-IN"/>
+          <w14:ligatures w14:val="none"/>
+        </w:rPr>
+        <w:t>30</w:t>
+      </w:r>
+    </w:p>
+    <w:p>
+      <w:pPr>
+        <w:pStyle w:val="ListParagraph"/>
+        <w:spacing w:before="100" w:beforeAutospacing="1" w:after="100" w:afterAutospacing="1" w:line="240" w:lineRule="auto"/>
+        <w:rPr>
+          <w:rFonts w:ascii="Times New Roman" w:eastAsia="Times New Roman" w:hAnsi="Times New Roman" w:cs="Times New Roman"/>
+          <w:kern w:val="0"/>
+          <w:lang w:eastAsia="en-IN"/>
+          <w14:ligatures w14:val="none"/>
+        </w:rPr>
+      </w:pPr>
+      <w:r>
+        <w:rPr>
+          <w:rFonts w:ascii="Times New Roman" w:eastAsia="Times New Roman" w:hAnsi="Times New Roman" w:cs="Times New Roman"/>
+          <w:kern w:val="0"/>
+          <w:lang w:eastAsia="en-IN"/>
+          <w14:ligatures w14:val="none"/>
+        </w:rPr>
+        <w:t>40</w:t>
+      </w:r>
+    </w:p>
+    <w:p>
+      <w:pPr>
+        <w:pStyle w:val="ListParagraph"/>
+        <w:spacing w:before="100" w:beforeAutospacing="1" w:after="100" w:afterAutospacing="1" w:line="240" w:lineRule="auto"/>
+        <w:rPr>
+          <w:rFonts w:ascii="Times New Roman" w:eastAsia="Times New Roman" w:hAnsi="Times New Roman" w:cs="Times New Roman"/>
+          <w:kern w:val="0"/>
+          <w:lang w:eastAsia="en-IN"/>
+          <w14:ligatures w14:val="none"/>
+        </w:rPr>
+      </w:pPr>
+      <w:r>
+        <w:rPr>
+          <w:rFonts w:ascii="Times New Roman" w:eastAsia="Times New Roman" w:hAnsi="Times New Roman" w:cs="Times New Roman"/>
+          <w:kern w:val="0"/>
+          <w:lang w:eastAsia="en-IN"/>
+          <w14:ligatures w14:val="none"/>
+        </w:rPr>
+        <w:t>50</w:t>
+      </w:r>
+    </w:p>
+    <w:p>
+      <w:pPr>
+        <w:pStyle w:val="ListParagraph"/>
+        <w:spacing w:before="100" w:beforeAutospacing="1" w:after="100" w:afterAutospacing="1" w:line="240" w:lineRule="auto"/>
+        <w:rPr>
+          <w:rFonts w:ascii="Times New Roman" w:eastAsia="Times New Roman" w:hAnsi="Times New Roman" w:cs="Times New Roman"/>
+          <w:kern w:val="0"/>
+          <w:lang w:eastAsia="en-IN"/>
+          <w14:ligatures w14:val="none"/>
+        </w:rPr>
+      </w:pPr>
+      <w:r>
+        <w:rPr>
+          <w:rFonts w:ascii="Times New Roman" w:eastAsia="Times New Roman" w:hAnsi="Times New Roman" w:cs="Times New Roman"/>
+          <w:kern w:val="0"/>
+          <w:lang w:eastAsia="en-IN"/>
+          <w14:ligatures w14:val="none"/>
+        </w:rPr>
+        <w:t xml:space="preserve">Because multiple elements may need to move, insertion and deletion take </w:t>
+      </w:r>
+      <w:r>
+        <w:rPr>
+          <w:rFonts w:ascii="Times New Roman" w:eastAsia="Times New Roman" w:hAnsi="Times New Roman" w:cs="Times New Roman"/>
+          <w:b/>
+          <w:bCs/>
+          <w:kern w:val="0"/>
+          <w:lang w:eastAsia="en-IN"/>
+          <w14:ligatures w14:val="none"/>
+        </w:rPr>
+        <w:t>O(n)</w:t>
+      </w:r>
+      <w:r>
+        <w:rPr>
+          <w:rFonts w:ascii="Times New Roman" w:eastAsia="Times New Roman" w:hAnsi="Times New Roman" w:cs="Times New Roman"/>
+          <w:kern w:val="0"/>
+          <w:lang w:eastAsia="en-IN"/>
+          <w14:ligatures w14:val="none"/>
+        </w:rPr>
+        <w:t xml:space="preserve"> time in the worst case.</w:t>
+      </w:r>
+    </w:p>
+    <w:p/>
+    <w:p>
+      <w:pPr>
+        <w:rPr>
+          <w:b/>
+          <w:bCs/>
+        </w:rPr>
+      </w:pPr>
+      <w:r>
+        <w:rPr>
+          <w:rFonts w:ascii="Segoe UI Emoji" w:hAnsi="Segoe UI Emoji" w:cs="Segoe UI Emoji"/>
+          <w:b/>
+          <w:bCs/>
+        </w:rPr>
+        <w:lastRenderedPageBreak/>
+        <w:t>📌</w:t>
+      </w:r>
+      <w:r>
+        <w:rPr>
+          <w:b/>
+          <w:bCs/>
+        </w:rPr>
+        <w:t xml:space="preserve"> Key Interview Points</w:t>
+      </w:r>
+    </w:p>
+    <w:p>
+      <w:pPr>
+        <w:numPr>
+          <w:ilvl w:val="0"/>
+          <w:numId w:val="14"/>
+        </w:numPr>
+        <w:rPr>
+          <w:b/>
+          <w:bCs/>
+        </w:rPr>
+      </w:pPr>
+      <w:r>
+        <w:rPr>
+          <w:b/>
+          <w:bCs/>
+        </w:rPr>
+        <w:t xml:space="preserve">Arrays store elements in contiguous memory. </w:t>
+      </w:r>
+    </w:p>
+    <w:p>
+      <w:pPr>
+        <w:numPr>
+          <w:ilvl w:val="0"/>
+          <w:numId w:val="14"/>
+        </w:numPr>
+        <w:rPr>
+          <w:b/>
+          <w:bCs/>
+        </w:rPr>
+      </w:pPr>
+      <w:r>
+        <w:rPr>
+          <w:b/>
+          <w:bCs/>
+        </w:rPr>
+        <w:t xml:space="preserve">Arrays have a fixed size. </w:t>
+      </w:r>
+    </w:p>
+    <w:p>
+      <w:pPr>
+        <w:numPr>
+          <w:ilvl w:val="0"/>
+          <w:numId w:val="14"/>
+        </w:numPr>
+        <w:rPr>
+          <w:b/>
+          <w:bCs/>
+        </w:rPr>
+      </w:pPr>
+      <w:r>
+        <w:rPr>
+          <w:b/>
+          <w:bCs/>
+        </w:rPr>
+        <w:t xml:space="preserve">Insertion requires right shifting. </w:t>
+      </w:r>
+    </w:p>
+    <w:p>
+      <w:pPr>
+        <w:numPr>
+          <w:ilvl w:val="0"/>
+          <w:numId w:val="14"/>
+        </w:numPr>
+        <w:rPr>
+          <w:b/>
+          <w:bCs/>
+        </w:rPr>
+      </w:pPr>
+      <w:r>
+        <w:rPr>
+          <w:b/>
+          <w:bCs/>
+        </w:rPr>
+        <w:t xml:space="preserve">Deletion requires left shifting. </w:t>
+      </w:r>
+    </w:p>
+    <w:p>
+      <w:pPr>
+        <w:numPr>
+          <w:ilvl w:val="0"/>
+          <w:numId w:val="14"/>
+        </w:numPr>
+        <w:rPr>
+          <w:b/>
+          <w:bCs/>
+        </w:rPr>
+      </w:pPr>
+      <w:r>
+        <w:rPr>
+          <w:b/>
+          <w:bCs/>
+        </w:rPr>
+        <w:t xml:space="preserve">Reversing an array efficiently uses the Two Pointer Technique. </w:t>
+      </w:r>
+    </w:p>
+    <w:p>
+      <w:pPr>
+        <w:numPr>
+          <w:ilvl w:val="0"/>
+          <w:numId w:val="14"/>
+        </w:numPr>
+        <w:rPr>
+          <w:b/>
+          <w:bCs/>
+        </w:rPr>
+      </w:pPr>
+      <w:r>
+        <w:rPr>
+          <w:b/>
+          <w:bCs/>
+        </w:rPr>
+        <w:t>Finding the second largest element can be done in one traversal (O(n)), without sorting.</w:t>
+      </w:r>
+    </w:p>
+    <w:p>
+      <w:pPr>
+        <w:rPr>
+          <w:b/>
+          <w:bCs/>
+        </w:rPr>
+      </w:pPr>
+    </w:p>
     <w:sectPr>
       <w:pgSz w:w="11906" w:h="16838"/>
       <w:pgMar w:top="1440" w:right="1440" w:bottom="1440" w:left="1440" w:header="708" w:footer="708" w:gutter="0"/>
@@ -2057,6 +3961,232 @@
     </w:lvl>
   </w:abstractNum>
   <w:abstractNum w:abstractNumId="2" w15:restartNumberingAfterBreak="0">
+    <w:nsid w:val="20726603"/>
+    <w:multiLevelType w:val="multilevel"/>
+    <w:tmpl w:val="9076AB08"/>
+    <w:lvl w:ilvl="0">
+      <w:start w:val="1"/>
+      <w:numFmt w:val="decimal"/>
+      <w:lvlText w:val="%1."/>
+      <w:lvlJc w:val="left"/>
+      <w:pPr>
+        <w:tabs>
+          <w:tab w:val="num" w:pos="720"/>
+        </w:tabs>
+        <w:ind w:left="720" w:hanging="360"/>
+      </w:pPr>
+    </w:lvl>
+    <w:lvl w:ilvl="1" w:tentative="1">
+      <w:start w:val="1"/>
+      <w:numFmt w:val="decimal"/>
+      <w:lvlText w:val="%2."/>
+      <w:lvlJc w:val="left"/>
+      <w:pPr>
+        <w:tabs>
+          <w:tab w:val="num" w:pos="1440"/>
+        </w:tabs>
+        <w:ind w:left="1440" w:hanging="360"/>
+      </w:pPr>
+    </w:lvl>
+    <w:lvl w:ilvl="2" w:tentative="1">
+      <w:start w:val="1"/>
+      <w:numFmt w:val="decimal"/>
+      <w:lvlText w:val="%3."/>
+      <w:lvlJc w:val="left"/>
+      <w:pPr>
+        <w:tabs>
+          <w:tab w:val="num" w:pos="2160"/>
+        </w:tabs>
+        <w:ind w:left="2160" w:hanging="360"/>
+      </w:pPr>
+    </w:lvl>
+    <w:lvl w:ilvl="3" w:tentative="1">
+      <w:start w:val="1"/>
+      <w:numFmt w:val="decimal"/>
+      <w:lvlText w:val="%4."/>
+      <w:lvlJc w:val="left"/>
+      <w:pPr>
+        <w:tabs>
+          <w:tab w:val="num" w:pos="2880"/>
+        </w:tabs>
+        <w:ind w:left="2880" w:hanging="360"/>
+      </w:pPr>
+    </w:lvl>
+    <w:lvl w:ilvl="4" w:tentative="1">
+      <w:start w:val="1"/>
+      <w:numFmt w:val="decimal"/>
+      <w:lvlText w:val="%5."/>
+      <w:lvlJc w:val="left"/>
+      <w:pPr>
+        <w:tabs>
+          <w:tab w:val="num" w:pos="3600"/>
+        </w:tabs>
+        <w:ind w:left="3600" w:hanging="360"/>
+      </w:pPr>
+    </w:lvl>
+    <w:lvl w:ilvl="5" w:tentative="1">
+      <w:start w:val="1"/>
+      <w:numFmt w:val="decimal"/>
+      <w:lvlText w:val="%6."/>
+      <w:lvlJc w:val="left"/>
+      <w:pPr>
+        <w:tabs>
+          <w:tab w:val="num" w:pos="4320"/>
+        </w:tabs>
+        <w:ind w:left="4320" w:hanging="360"/>
+      </w:pPr>
+    </w:lvl>
+    <w:lvl w:ilvl="6" w:tentative="1">
+      <w:start w:val="1"/>
+      <w:numFmt w:val="decimal"/>
+      <w:lvlText w:val="%7."/>
+      <w:lvlJc w:val="left"/>
+      <w:pPr>
+        <w:tabs>
+          <w:tab w:val="num" w:pos="5040"/>
+        </w:tabs>
+        <w:ind w:left="5040" w:hanging="360"/>
+      </w:pPr>
+    </w:lvl>
+    <w:lvl w:ilvl="7" w:tentative="1">
+      <w:start w:val="1"/>
+      <w:numFmt w:val="decimal"/>
+      <w:lvlText w:val="%8."/>
+      <w:lvlJc w:val="left"/>
+      <w:pPr>
+        <w:tabs>
+          <w:tab w:val="num" w:pos="5760"/>
+        </w:tabs>
+        <w:ind w:left="5760" w:hanging="360"/>
+      </w:pPr>
+    </w:lvl>
+    <w:lvl w:ilvl="8" w:tentative="1">
+      <w:start w:val="1"/>
+      <w:numFmt w:val="decimal"/>
+      <w:lvlText w:val="%9."/>
+      <w:lvlJc w:val="left"/>
+      <w:pPr>
+        <w:tabs>
+          <w:tab w:val="num" w:pos="6480"/>
+        </w:tabs>
+        <w:ind w:left="6480" w:hanging="360"/>
+      </w:pPr>
+    </w:lvl>
+  </w:abstractNum>
+  <w:abstractNum w:abstractNumId="3" w15:restartNumberingAfterBreak="0">
+    <w:nsid w:val="2D304560"/>
+    <w:multiLevelType w:val="multilevel"/>
+    <w:tmpl w:val="4FBEBD78"/>
+    <w:lvl w:ilvl="0">
+      <w:start w:val="1"/>
+      <w:numFmt w:val="decimal"/>
+      <w:lvlText w:val="%1."/>
+      <w:lvlJc w:val="left"/>
+      <w:pPr>
+        <w:tabs>
+          <w:tab w:val="num" w:pos="720"/>
+        </w:tabs>
+        <w:ind w:left="720" w:hanging="360"/>
+      </w:pPr>
+    </w:lvl>
+    <w:lvl w:ilvl="1" w:tentative="1">
+      <w:start w:val="1"/>
+      <w:numFmt w:val="decimal"/>
+      <w:lvlText w:val="%2."/>
+      <w:lvlJc w:val="left"/>
+      <w:pPr>
+        <w:tabs>
+          <w:tab w:val="num" w:pos="1440"/>
+        </w:tabs>
+        <w:ind w:left="1440" w:hanging="360"/>
+      </w:pPr>
+    </w:lvl>
+    <w:lvl w:ilvl="2" w:tentative="1">
+      <w:start w:val="1"/>
+      <w:numFmt w:val="decimal"/>
+      <w:lvlText w:val="%3."/>
+      <w:lvlJc w:val="left"/>
+      <w:pPr>
+        <w:tabs>
+          <w:tab w:val="num" w:pos="2160"/>
+        </w:tabs>
+        <w:ind w:left="2160" w:hanging="360"/>
+      </w:pPr>
+    </w:lvl>
+    <w:lvl w:ilvl="3" w:tentative="1">
+      <w:start w:val="1"/>
+      <w:numFmt w:val="decimal"/>
+      <w:lvlText w:val="%4."/>
+      <w:lvlJc w:val="left"/>
+      <w:pPr>
+        <w:tabs>
+          <w:tab w:val="num" w:pos="2880"/>
+        </w:tabs>
+        <w:ind w:left="2880" w:hanging="360"/>
+      </w:pPr>
+    </w:lvl>
+    <w:lvl w:ilvl="4" w:tentative="1">
+      <w:start w:val="1"/>
+      <w:numFmt w:val="decimal"/>
+      <w:lvlText w:val="%5."/>
+      <w:lvlJc w:val="left"/>
+      <w:pPr>
+        <w:tabs>
+          <w:tab w:val="num" w:pos="3600"/>
+        </w:tabs>
+        <w:ind w:left="3600" w:hanging="360"/>
+      </w:pPr>
+    </w:lvl>
+    <w:lvl w:ilvl="5" w:tentative="1">
+      <w:start w:val="1"/>
+      <w:numFmt w:val="decimal"/>
+      <w:lvlText w:val="%6."/>
+      <w:lvlJc w:val="left"/>
+      <w:pPr>
+        <w:tabs>
+          <w:tab w:val="num" w:pos="4320"/>
+        </w:tabs>
+        <w:ind w:left="4320" w:hanging="360"/>
+      </w:pPr>
+    </w:lvl>
+    <w:lvl w:ilvl="6" w:tentative="1">
+      <w:start w:val="1"/>
+      <w:numFmt w:val="decimal"/>
+      <w:lvlText w:val="%7."/>
+      <w:lvlJc w:val="left"/>
+      <w:pPr>
+        <w:tabs>
+          <w:tab w:val="num" w:pos="5040"/>
+        </w:tabs>
+        <w:ind w:left="5040" w:hanging="360"/>
+      </w:pPr>
+    </w:lvl>
+    <w:lvl w:ilvl="7" w:tentative="1">
+      <w:start w:val="1"/>
+      <w:numFmt w:val="decimal"/>
+      <w:lvlText w:val="%8."/>
+      <w:lvlJc w:val="left"/>
+      <w:pPr>
+        <w:tabs>
+          <w:tab w:val="num" w:pos="5760"/>
+        </w:tabs>
+        <w:ind w:left="5760" w:hanging="360"/>
+      </w:pPr>
+    </w:lvl>
+    <w:lvl w:ilvl="8" w:tentative="1">
+      <w:start w:val="1"/>
+      <w:numFmt w:val="decimal"/>
+      <w:lvlText w:val="%9."/>
+      <w:lvlJc w:val="left"/>
+      <w:pPr>
+        <w:tabs>
+          <w:tab w:val="num" w:pos="6480"/>
+        </w:tabs>
+        <w:ind w:left="6480" w:hanging="360"/>
+      </w:pPr>
+    </w:lvl>
+  </w:abstractNum>
+  <w:abstractNum w:abstractNumId="4" w15:restartNumberingAfterBreak="0">
     <w:nsid w:val="2E0A60B1"/>
     <w:multiLevelType w:val="multilevel"/>
     <w:tmpl w:val="6A7A6232"/>
@@ -2169,7 +4299,7 @@
       </w:pPr>
     </w:lvl>
   </w:abstractNum>
-  <w:abstractNum w:abstractNumId="3" w15:restartNumberingAfterBreak="0">
+  <w:abstractNum w:abstractNumId="5" w15:restartNumberingAfterBreak="0">
     <w:nsid w:val="30364D4E"/>
     <w:multiLevelType w:val="multilevel"/>
     <w:tmpl w:val="DD28C87A"/>
@@ -2318,7 +4448,305 @@
       </w:rPr>
     </w:lvl>
   </w:abstractNum>
-  <w:abstractNum w:abstractNumId="4" w15:restartNumberingAfterBreak="0">
+  <w:abstractNum w:abstractNumId="6" w15:restartNumberingAfterBreak="0">
+    <w:nsid w:val="339B0165"/>
+    <w:multiLevelType w:val="multilevel"/>
+    <w:tmpl w:val="7A5E0030"/>
+    <w:lvl w:ilvl="0">
+      <w:start w:val="1"/>
+      <w:numFmt w:val="bullet"/>
+      <w:lvlText w:val=""/>
+      <w:lvlJc w:val="left"/>
+      <w:pPr>
+        <w:tabs>
+          <w:tab w:val="num" w:pos="720"/>
+        </w:tabs>
+        <w:ind w:left="720" w:hanging="360"/>
+      </w:pPr>
+      <w:rPr>
+        <w:rFonts w:ascii="Symbol" w:hAnsi="Symbol" w:hint="default"/>
+        <w:sz w:val="20"/>
+      </w:rPr>
+    </w:lvl>
+    <w:lvl w:ilvl="1" w:tentative="1">
+      <w:start w:val="1"/>
+      <w:numFmt w:val="bullet"/>
+      <w:lvlText w:val="o"/>
+      <w:lvlJc w:val="left"/>
+      <w:pPr>
+        <w:tabs>
+          <w:tab w:val="num" w:pos="1440"/>
+        </w:tabs>
+        <w:ind w:left="1440" w:hanging="360"/>
+      </w:pPr>
+      <w:rPr>
+        <w:rFonts w:ascii="Courier New" w:hAnsi="Courier New" w:hint="default"/>
+        <w:sz w:val="20"/>
+      </w:rPr>
+    </w:lvl>
+    <w:lvl w:ilvl="2" w:tentative="1">
+      <w:start w:val="1"/>
+      <w:numFmt w:val="bullet"/>
+      <w:lvlText w:val=""/>
+      <w:lvlJc w:val="left"/>
+      <w:pPr>
+        <w:tabs>
+          <w:tab w:val="num" w:pos="2160"/>
+        </w:tabs>
+        <w:ind w:left="2160" w:hanging="360"/>
+      </w:pPr>
+      <w:rPr>
+        <w:rFonts w:ascii="Wingdings" w:hAnsi="Wingdings" w:hint="default"/>
+        <w:sz w:val="20"/>
+      </w:rPr>
+    </w:lvl>
+    <w:lvl w:ilvl="3" w:tentative="1">
+      <w:start w:val="1"/>
+      <w:numFmt w:val="bullet"/>
+      <w:lvlText w:val=""/>
+      <w:lvlJc w:val="left"/>
+      <w:pPr>
+        <w:tabs>
+          <w:tab w:val="num" w:pos="2880"/>
+        </w:tabs>
+        <w:ind w:left="2880" w:hanging="360"/>
+      </w:pPr>
+      <w:rPr>
+        <w:rFonts w:ascii="Wingdings" w:hAnsi="Wingdings" w:hint="default"/>
+        <w:sz w:val="20"/>
+      </w:rPr>
+    </w:lvl>
+    <w:lvl w:ilvl="4" w:tentative="1">
+      <w:start w:val="1"/>
+      <w:numFmt w:val="bullet"/>
+      <w:lvlText w:val=""/>
+      <w:lvlJc w:val="left"/>
+      <w:pPr>
+        <w:tabs>
+          <w:tab w:val="num" w:pos="3600"/>
+        </w:tabs>
+        <w:ind w:left="3600" w:hanging="360"/>
+      </w:pPr>
+      <w:rPr>
+        <w:rFonts w:ascii="Wingdings" w:hAnsi="Wingdings" w:hint="default"/>
+        <w:sz w:val="20"/>
+      </w:rPr>
+    </w:lvl>
+    <w:lvl w:ilvl="5" w:tentative="1">
+      <w:start w:val="1"/>
+      <w:numFmt w:val="bullet"/>
+      <w:lvlText w:val=""/>
+      <w:lvlJc w:val="left"/>
+      <w:pPr>
+        <w:tabs>
+          <w:tab w:val="num" w:pos="4320"/>
+        </w:tabs>
+        <w:ind w:left="4320" w:hanging="360"/>
+      </w:pPr>
+      <w:rPr>
+        <w:rFonts w:ascii="Wingdings" w:hAnsi="Wingdings" w:hint="default"/>
+        <w:sz w:val="20"/>
+      </w:rPr>
+    </w:lvl>
+    <w:lvl w:ilvl="6" w:tentative="1">
+      <w:start w:val="1"/>
+      <w:numFmt w:val="bullet"/>
+      <w:lvlText w:val=""/>
+      <w:lvlJc w:val="left"/>
+      <w:pPr>
+        <w:tabs>
+          <w:tab w:val="num" w:pos="5040"/>
+        </w:tabs>
+        <w:ind w:left="5040" w:hanging="360"/>
+      </w:pPr>
+      <w:rPr>
+        <w:rFonts w:ascii="Wingdings" w:hAnsi="Wingdings" w:hint="default"/>
+        <w:sz w:val="20"/>
+      </w:rPr>
+    </w:lvl>
+    <w:lvl w:ilvl="7" w:tentative="1">
+      <w:start w:val="1"/>
+      <w:numFmt w:val="bullet"/>
+      <w:lvlText w:val=""/>
+      <w:lvlJc w:val="left"/>
+      <w:pPr>
+        <w:tabs>
+          <w:tab w:val="num" w:pos="5760"/>
+        </w:tabs>
+        <w:ind w:left="5760" w:hanging="360"/>
+      </w:pPr>
+      <w:rPr>
+        <w:rFonts w:ascii="Wingdings" w:hAnsi="Wingdings" w:hint="default"/>
+        <w:sz w:val="20"/>
+      </w:rPr>
+    </w:lvl>
+    <w:lvl w:ilvl="8" w:tentative="1">
+      <w:start w:val="1"/>
+      <w:numFmt w:val="bullet"/>
+      <w:lvlText w:val=""/>
+      <w:lvlJc w:val="left"/>
+      <w:pPr>
+        <w:tabs>
+          <w:tab w:val="num" w:pos="6480"/>
+        </w:tabs>
+        <w:ind w:left="6480" w:hanging="360"/>
+      </w:pPr>
+      <w:rPr>
+        <w:rFonts w:ascii="Wingdings" w:hAnsi="Wingdings" w:hint="default"/>
+        <w:sz w:val="20"/>
+      </w:rPr>
+    </w:lvl>
+  </w:abstractNum>
+  <w:abstractNum w:abstractNumId="7" w15:restartNumberingAfterBreak="0">
+    <w:nsid w:val="41B92AE6"/>
+    <w:multiLevelType w:val="multilevel"/>
+    <w:tmpl w:val="EE6ADCCA"/>
+    <w:lvl w:ilvl="0">
+      <w:start w:val="1"/>
+      <w:numFmt w:val="bullet"/>
+      <w:lvlText w:val=""/>
+      <w:lvlJc w:val="left"/>
+      <w:pPr>
+        <w:tabs>
+          <w:tab w:val="num" w:pos="720"/>
+        </w:tabs>
+        <w:ind w:left="720" w:hanging="360"/>
+      </w:pPr>
+      <w:rPr>
+        <w:rFonts w:ascii="Symbol" w:hAnsi="Symbol" w:hint="default"/>
+        <w:sz w:val="20"/>
+      </w:rPr>
+    </w:lvl>
+    <w:lvl w:ilvl="1" w:tentative="1">
+      <w:start w:val="1"/>
+      <w:numFmt w:val="bullet"/>
+      <w:lvlText w:val="o"/>
+      <w:lvlJc w:val="left"/>
+      <w:pPr>
+        <w:tabs>
+          <w:tab w:val="num" w:pos="1440"/>
+        </w:tabs>
+        <w:ind w:left="1440" w:hanging="360"/>
+      </w:pPr>
+      <w:rPr>
+        <w:rFonts w:ascii="Courier New" w:hAnsi="Courier New" w:hint="default"/>
+        <w:sz w:val="20"/>
+      </w:rPr>
+    </w:lvl>
+    <w:lvl w:ilvl="2" w:tentative="1">
+      <w:start w:val="1"/>
+      <w:numFmt w:val="bullet"/>
+      <w:lvlText w:val=""/>
+      <w:lvlJc w:val="left"/>
+      <w:pPr>
+        <w:tabs>
+          <w:tab w:val="num" w:pos="2160"/>
+        </w:tabs>
+        <w:ind w:left="2160" w:hanging="360"/>
+      </w:pPr>
+      <w:rPr>
+        <w:rFonts w:ascii="Wingdings" w:hAnsi="Wingdings" w:hint="default"/>
+        <w:sz w:val="20"/>
+      </w:rPr>
+    </w:lvl>
+    <w:lvl w:ilvl="3" w:tentative="1">
+      <w:start w:val="1"/>
+      <w:numFmt w:val="bullet"/>
+      <w:lvlText w:val=""/>
+      <w:lvlJc w:val="left"/>
+      <w:pPr>
+        <w:tabs>
+          <w:tab w:val="num" w:pos="2880"/>
+        </w:tabs>
+        <w:ind w:left="2880" w:hanging="360"/>
+      </w:pPr>
+      <w:rPr>
+        <w:rFonts w:ascii="Wingdings" w:hAnsi="Wingdings" w:hint="default"/>
+        <w:sz w:val="20"/>
+      </w:rPr>
+    </w:lvl>
+    <w:lvl w:ilvl="4" w:tentative="1">
+      <w:start w:val="1"/>
+      <w:numFmt w:val="bullet"/>
+      <w:lvlText w:val=""/>
+      <w:lvlJc w:val="left"/>
+      <w:pPr>
+        <w:tabs>
+          <w:tab w:val="num" w:pos="3600"/>
+        </w:tabs>
+        <w:ind w:left="3600" w:hanging="360"/>
+      </w:pPr>
+      <w:rPr>
+        <w:rFonts w:ascii="Wingdings" w:hAnsi="Wingdings" w:hint="default"/>
+        <w:sz w:val="20"/>
+      </w:rPr>
+    </w:lvl>
+    <w:lvl w:ilvl="5" w:tentative="1">
+      <w:start w:val="1"/>
+      <w:numFmt w:val="bullet"/>
+      <w:lvlText w:val=""/>
+      <w:lvlJc w:val="left"/>
+      <w:pPr>
+        <w:tabs>
+          <w:tab w:val="num" w:pos="4320"/>
+        </w:tabs>
+        <w:ind w:left="4320" w:hanging="360"/>
+      </w:pPr>
+      <w:rPr>
+        <w:rFonts w:ascii="Wingdings" w:hAnsi="Wingdings" w:hint="default"/>
+        <w:sz w:val="20"/>
+      </w:rPr>
+    </w:lvl>
+    <w:lvl w:ilvl="6" w:tentative="1">
+      <w:start w:val="1"/>
+      <w:numFmt w:val="bullet"/>
+      <w:lvlText w:val=""/>
+      <w:lvlJc w:val="left"/>
+      <w:pPr>
+        <w:tabs>
+          <w:tab w:val="num" w:pos="5040"/>
+        </w:tabs>
+        <w:ind w:left="5040" w:hanging="360"/>
+      </w:pPr>
+      <w:rPr>
+        <w:rFonts w:ascii="Wingdings" w:hAnsi="Wingdings" w:hint="default"/>
+        <w:sz w:val="20"/>
+      </w:rPr>
+    </w:lvl>
+    <w:lvl w:ilvl="7" w:tentative="1">
+      <w:start w:val="1"/>
+      <w:numFmt w:val="bullet"/>
+      <w:lvlText w:val=""/>
+      <w:lvlJc w:val="left"/>
+      <w:pPr>
+        <w:tabs>
+          <w:tab w:val="num" w:pos="5760"/>
+        </w:tabs>
+        <w:ind w:left="5760" w:hanging="360"/>
+      </w:pPr>
+      <w:rPr>
+        <w:rFonts w:ascii="Wingdings" w:hAnsi="Wingdings" w:hint="default"/>
+        <w:sz w:val="20"/>
+      </w:rPr>
+    </w:lvl>
+    <w:lvl w:ilvl="8" w:tentative="1">
+      <w:start w:val="1"/>
+      <w:numFmt w:val="bullet"/>
+      <w:lvlText w:val=""/>
+      <w:lvlJc w:val="left"/>
+      <w:pPr>
+        <w:tabs>
+          <w:tab w:val="num" w:pos="6480"/>
+        </w:tabs>
+        <w:ind w:left="6480" w:hanging="360"/>
+      </w:pPr>
+      <w:rPr>
+        <w:rFonts w:ascii="Wingdings" w:hAnsi="Wingdings" w:hint="default"/>
+        <w:sz w:val="20"/>
+      </w:rPr>
+    </w:lvl>
+  </w:abstractNum>
+  <w:abstractNum w:abstractNumId="8" w15:restartNumberingAfterBreak="0">
     <w:nsid w:val="4A3C22F7"/>
     <w:multiLevelType w:val="multilevel"/>
     <w:tmpl w:val="2632D542"/>
@@ -2467,7 +4895,7 @@
       </w:rPr>
     </w:lvl>
   </w:abstractNum>
-  <w:abstractNum w:abstractNumId="5" w15:restartNumberingAfterBreak="0">
+  <w:abstractNum w:abstractNumId="9" w15:restartNumberingAfterBreak="0">
     <w:nsid w:val="4B0E2839"/>
     <w:multiLevelType w:val="multilevel"/>
     <w:tmpl w:val="90F46DC4"/>
@@ -2616,7 +5044,156 @@
       </w:rPr>
     </w:lvl>
   </w:abstractNum>
-  <w:abstractNum w:abstractNumId="6" w15:restartNumberingAfterBreak="0">
+  <w:abstractNum w:abstractNumId="10" w15:restartNumberingAfterBreak="0">
+    <w:nsid w:val="5D110D27"/>
+    <w:multiLevelType w:val="multilevel"/>
+    <w:tmpl w:val="6EFA01B4"/>
+    <w:lvl w:ilvl="0">
+      <w:start w:val="1"/>
+      <w:numFmt w:val="bullet"/>
+      <w:lvlText w:val=""/>
+      <w:lvlJc w:val="left"/>
+      <w:pPr>
+        <w:tabs>
+          <w:tab w:val="num" w:pos="720"/>
+        </w:tabs>
+        <w:ind w:left="720" w:hanging="360"/>
+      </w:pPr>
+      <w:rPr>
+        <w:rFonts w:ascii="Symbol" w:hAnsi="Symbol" w:hint="default"/>
+        <w:sz w:val="20"/>
+      </w:rPr>
+    </w:lvl>
+    <w:lvl w:ilvl="1" w:tentative="1">
+      <w:start w:val="1"/>
+      <w:numFmt w:val="bullet"/>
+      <w:lvlText w:val="o"/>
+      <w:lvlJc w:val="left"/>
+      <w:pPr>
+        <w:tabs>
+          <w:tab w:val="num" w:pos="1440"/>
+        </w:tabs>
+        <w:ind w:left="1440" w:hanging="360"/>
+      </w:pPr>
+      <w:rPr>
+        <w:rFonts w:ascii="Courier New" w:hAnsi="Courier New" w:hint="default"/>
+        <w:sz w:val="20"/>
+      </w:rPr>
+    </w:lvl>
+    <w:lvl w:ilvl="2" w:tentative="1">
+      <w:start w:val="1"/>
+      <w:numFmt w:val="bullet"/>
+      <w:lvlText w:val=""/>
+      <w:lvlJc w:val="left"/>
+      <w:pPr>
+        <w:tabs>
+          <w:tab w:val="num" w:pos="2160"/>
+        </w:tabs>
+        <w:ind w:left="2160" w:hanging="360"/>
+      </w:pPr>
+      <w:rPr>
+        <w:rFonts w:ascii="Wingdings" w:hAnsi="Wingdings" w:hint="default"/>
+        <w:sz w:val="20"/>
+      </w:rPr>
+    </w:lvl>
+    <w:lvl w:ilvl="3" w:tentative="1">
+      <w:start w:val="1"/>
+      <w:numFmt w:val="bullet"/>
+      <w:lvlText w:val=""/>
+      <w:lvlJc w:val="left"/>
+      <w:pPr>
+        <w:tabs>
+          <w:tab w:val="num" w:pos="2880"/>
+        </w:tabs>
+        <w:ind w:left="2880" w:hanging="360"/>
+      </w:pPr>
+      <w:rPr>
+        <w:rFonts w:ascii="Wingdings" w:hAnsi="Wingdings" w:hint="default"/>
+        <w:sz w:val="20"/>
+      </w:rPr>
+    </w:lvl>
+    <w:lvl w:ilvl="4" w:tentative="1">
+      <w:start w:val="1"/>
+      <w:numFmt w:val="bullet"/>
+      <w:lvlText w:val=""/>
+      <w:lvlJc w:val="left"/>
+      <w:pPr>
+        <w:tabs>
+          <w:tab w:val="num" w:pos="3600"/>
+        </w:tabs>
+        <w:ind w:left="3600" w:hanging="360"/>
+      </w:pPr>
+      <w:rPr>
+        <w:rFonts w:ascii="Wingdings" w:hAnsi="Wingdings" w:hint="default"/>
+        <w:sz w:val="20"/>
+      </w:rPr>
+    </w:lvl>
+    <w:lvl w:ilvl="5" w:tentative="1">
+      <w:start w:val="1"/>
+      <w:numFmt w:val="bullet"/>
+      <w:lvlText w:val=""/>
+      <w:lvlJc w:val="left"/>
+      <w:pPr>
+        <w:tabs>
+          <w:tab w:val="num" w:pos="4320"/>
+        </w:tabs>
+        <w:ind w:left="4320" w:hanging="360"/>
+      </w:pPr>
+      <w:rPr>
+        <w:rFonts w:ascii="Wingdings" w:hAnsi="Wingdings" w:hint="default"/>
+        <w:sz w:val="20"/>
+      </w:rPr>
+    </w:lvl>
+    <w:lvl w:ilvl="6" w:tentative="1">
+      <w:start w:val="1"/>
+      <w:numFmt w:val="bullet"/>
+      <w:lvlText w:val=""/>
+      <w:lvlJc w:val="left"/>
+      <w:pPr>
+        <w:tabs>
+          <w:tab w:val="num" w:pos="5040"/>
+        </w:tabs>
+        <w:ind w:left="5040" w:hanging="360"/>
+      </w:pPr>
+      <w:rPr>
+        <w:rFonts w:ascii="Wingdings" w:hAnsi="Wingdings" w:hint="default"/>
+        <w:sz w:val="20"/>
+      </w:rPr>
+    </w:lvl>
+    <w:lvl w:ilvl="7" w:tentative="1">
+      <w:start w:val="1"/>
+      <w:numFmt w:val="bullet"/>
+      <w:lvlText w:val=""/>
+      <w:lvlJc w:val="left"/>
+      <w:pPr>
+        <w:tabs>
+          <w:tab w:val="num" w:pos="5760"/>
+        </w:tabs>
+        <w:ind w:left="5760" w:hanging="360"/>
+      </w:pPr>
+      <w:rPr>
+        <w:rFonts w:ascii="Wingdings" w:hAnsi="Wingdings" w:hint="default"/>
+        <w:sz w:val="20"/>
+      </w:rPr>
+    </w:lvl>
+    <w:lvl w:ilvl="8" w:tentative="1">
+      <w:start w:val="1"/>
+      <w:numFmt w:val="bullet"/>
+      <w:lvlText w:val=""/>
+      <w:lvlJc w:val="left"/>
+      <w:pPr>
+        <w:tabs>
+          <w:tab w:val="num" w:pos="6480"/>
+        </w:tabs>
+        <w:ind w:left="6480" w:hanging="360"/>
+      </w:pPr>
+      <w:rPr>
+        <w:rFonts w:ascii="Wingdings" w:hAnsi="Wingdings" w:hint="default"/>
+        <w:sz w:val="20"/>
+      </w:rPr>
+    </w:lvl>
+  </w:abstractNum>
+  <w:abstractNum w:abstractNumId="11" w15:restartNumberingAfterBreak="0">
     <w:nsid w:val="67893E06"/>
     <w:multiLevelType w:val="hybridMultilevel"/>
     <w:tmpl w:val="E036F84E"/>
@@ -2705,7 +5282,7 @@
       </w:pPr>
     </w:lvl>
   </w:abstractNum>
-  <w:abstractNum w:abstractNumId="7" w15:restartNumberingAfterBreak="0">
+  <w:abstractNum w:abstractNumId="12" w15:restartNumberingAfterBreak="0">
     <w:nsid w:val="69121FB8"/>
     <w:multiLevelType w:val="multilevel"/>
     <w:tmpl w:val="352AED92"/>
@@ -2854,8 +5431,157 @@
       </w:rPr>
     </w:lvl>
   </w:abstractNum>
+  <w:abstractNum w:abstractNumId="13" w15:restartNumberingAfterBreak="0">
+    <w:nsid w:val="739863AF"/>
+    <w:multiLevelType w:val="multilevel"/>
+    <w:tmpl w:val="FD88F5BE"/>
+    <w:lvl w:ilvl="0">
+      <w:start w:val="1"/>
+      <w:numFmt w:val="bullet"/>
+      <w:lvlText w:val=""/>
+      <w:lvlJc w:val="left"/>
+      <w:pPr>
+        <w:tabs>
+          <w:tab w:val="num" w:pos="720"/>
+        </w:tabs>
+        <w:ind w:left="720" w:hanging="360"/>
+      </w:pPr>
+      <w:rPr>
+        <w:rFonts w:ascii="Symbol" w:hAnsi="Symbol" w:hint="default"/>
+        <w:sz w:val="20"/>
+      </w:rPr>
+    </w:lvl>
+    <w:lvl w:ilvl="1" w:tentative="1">
+      <w:start w:val="1"/>
+      <w:numFmt w:val="bullet"/>
+      <w:lvlText w:val="o"/>
+      <w:lvlJc w:val="left"/>
+      <w:pPr>
+        <w:tabs>
+          <w:tab w:val="num" w:pos="1440"/>
+        </w:tabs>
+        <w:ind w:left="1440" w:hanging="360"/>
+      </w:pPr>
+      <w:rPr>
+        <w:rFonts w:ascii="Courier New" w:hAnsi="Courier New" w:hint="default"/>
+        <w:sz w:val="20"/>
+      </w:rPr>
+    </w:lvl>
+    <w:lvl w:ilvl="2" w:tentative="1">
+      <w:start w:val="1"/>
+      <w:numFmt w:val="bullet"/>
+      <w:lvlText w:val=""/>
+      <w:lvlJc w:val="left"/>
+      <w:pPr>
+        <w:tabs>
+          <w:tab w:val="num" w:pos="2160"/>
+        </w:tabs>
+        <w:ind w:left="2160" w:hanging="360"/>
+      </w:pPr>
+      <w:rPr>
+        <w:rFonts w:ascii="Wingdings" w:hAnsi="Wingdings" w:hint="default"/>
+        <w:sz w:val="20"/>
+      </w:rPr>
+    </w:lvl>
+    <w:lvl w:ilvl="3" w:tentative="1">
+      <w:start w:val="1"/>
+      <w:numFmt w:val="bullet"/>
+      <w:lvlText w:val=""/>
+      <w:lvlJc w:val="left"/>
+      <w:pPr>
+        <w:tabs>
+          <w:tab w:val="num" w:pos="2880"/>
+        </w:tabs>
+        <w:ind w:left="2880" w:hanging="360"/>
+      </w:pPr>
+      <w:rPr>
+        <w:rFonts w:ascii="Wingdings" w:hAnsi="Wingdings" w:hint="default"/>
+        <w:sz w:val="20"/>
+      </w:rPr>
+    </w:lvl>
+    <w:lvl w:ilvl="4" w:tentative="1">
+      <w:start w:val="1"/>
+      <w:numFmt w:val="bullet"/>
+      <w:lvlText w:val=""/>
+      <w:lvlJc w:val="left"/>
+      <w:pPr>
+        <w:tabs>
+          <w:tab w:val="num" w:pos="3600"/>
+        </w:tabs>
+        <w:ind w:left="3600" w:hanging="360"/>
+      </w:pPr>
+      <w:rPr>
+        <w:rFonts w:ascii="Wingdings" w:hAnsi="Wingdings" w:hint="default"/>
+        <w:sz w:val="20"/>
+      </w:rPr>
+    </w:lvl>
+    <w:lvl w:ilvl="5" w:tentative="1">
+      <w:start w:val="1"/>
+      <w:numFmt w:val="bullet"/>
+      <w:lvlText w:val=""/>
+      <w:lvlJc w:val="left"/>
+      <w:pPr>
+        <w:tabs>
+          <w:tab w:val="num" w:pos="4320"/>
+        </w:tabs>
+        <w:ind w:left="4320" w:hanging="360"/>
+      </w:pPr>
+      <w:rPr>
+        <w:rFonts w:ascii="Wingdings" w:hAnsi="Wingdings" w:hint="default"/>
+        <w:sz w:val="20"/>
+      </w:rPr>
+    </w:lvl>
+    <w:lvl w:ilvl="6" w:tentative="1">
+      <w:start w:val="1"/>
+      <w:numFmt w:val="bullet"/>
+      <w:lvlText w:val=""/>
+      <w:lvlJc w:val="left"/>
+      <w:pPr>
+        <w:tabs>
+          <w:tab w:val="num" w:pos="5040"/>
+        </w:tabs>
+        <w:ind w:left="5040" w:hanging="360"/>
+      </w:pPr>
+      <w:rPr>
+        <w:rFonts w:ascii="Wingdings" w:hAnsi="Wingdings" w:hint="default"/>
+        <w:sz w:val="20"/>
+      </w:rPr>
+    </w:lvl>
+    <w:lvl w:ilvl="7" w:tentative="1">
+      <w:start w:val="1"/>
+      <w:numFmt w:val="bullet"/>
+      <w:lvlText w:val=""/>
+      <w:lvlJc w:val="left"/>
+      <w:pPr>
+        <w:tabs>
+          <w:tab w:val="num" w:pos="5760"/>
+        </w:tabs>
+        <w:ind w:left="5760" w:hanging="360"/>
+      </w:pPr>
+      <w:rPr>
+        <w:rFonts w:ascii="Wingdings" w:hAnsi="Wingdings" w:hint="default"/>
+        <w:sz w:val="20"/>
+      </w:rPr>
+    </w:lvl>
+    <w:lvl w:ilvl="8" w:tentative="1">
+      <w:start w:val="1"/>
+      <w:numFmt w:val="bullet"/>
+      <w:lvlText w:val=""/>
+      <w:lvlJc w:val="left"/>
+      <w:pPr>
+        <w:tabs>
+          <w:tab w:val="num" w:pos="6480"/>
+        </w:tabs>
+        <w:ind w:left="6480" w:hanging="360"/>
+      </w:pPr>
+      <w:rPr>
+        <w:rFonts w:ascii="Wingdings" w:hAnsi="Wingdings" w:hint="default"/>
+        <w:sz w:val="20"/>
+      </w:rPr>
+    </w:lvl>
+  </w:abstractNum>
   <w:num w:numId="1" w16cid:durableId="1975478752">
-    <w:abstractNumId w:val="4"/>
+    <w:abstractNumId w:val="8"/>
   </w:num>
   <w:num w:numId="2" w16cid:durableId="480316406">
     <w:abstractNumId w:val="1"/>
@@ -2864,19 +5590,37 @@
     <w:abstractNumId w:val="0"/>
   </w:num>
   <w:num w:numId="4" w16cid:durableId="1493792698">
+    <w:abstractNumId w:val="12"/>
+  </w:num>
+  <w:num w:numId="5" w16cid:durableId="954561693">
+    <w:abstractNumId w:val="11"/>
+  </w:num>
+  <w:num w:numId="6" w16cid:durableId="1472214054">
+    <w:abstractNumId w:val="4"/>
+  </w:num>
+  <w:num w:numId="7" w16cid:durableId="692341521">
+    <w:abstractNumId w:val="9"/>
+  </w:num>
+  <w:num w:numId="8" w16cid:durableId="1338267541">
+    <w:abstractNumId w:val="5"/>
+  </w:num>
+  <w:num w:numId="9" w16cid:durableId="1744915364">
     <w:abstractNumId w:val="7"/>
   </w:num>
-  <w:num w:numId="5" w16cid:durableId="954561693">
-    <w:abstractNumId w:val="6"/>
-  </w:num>
-  <w:num w:numId="6" w16cid:durableId="1472214054">
+  <w:num w:numId="10" w16cid:durableId="1638220645">
     <w:abstractNumId w:val="2"/>
   </w:num>
-  <w:num w:numId="7" w16cid:durableId="692341521">
-    <w:abstractNumId w:val="5"/>
+  <w:num w:numId="11" w16cid:durableId="315763294">
+    <w:abstractNumId w:val="3"/>
   </w:num>
-  <w:num w:numId="8" w16cid:durableId="1338267541">
-    <w:abstractNumId w:val="3"/>
+  <w:num w:numId="12" w16cid:durableId="291983191">
+    <w:abstractNumId w:val="13"/>
+  </w:num>
+  <w:num w:numId="13" w16cid:durableId="1329213776">
+    <w:abstractNumId w:val="10"/>
+  </w:num>
+  <w:num w:numId="14" w16cid:durableId="1389111650">
+    <w:abstractNumId w:val="6"/>
   </w:num>
 </w:numbering>
 </file>
@@ -3309,7 +6053,6 @@
     <w:next w:val="Normal"/>
     <w:link w:val="Heading2Char"/>
     <w:uiPriority w:val="9"/>
-    <w:semiHidden/>
     <w:unhideWhenUsed/>
     <w:qFormat/>
     <w:rsid w:val="00F918E3"/>
@@ -3332,7 +6075,6 @@
     <w:next w:val="Normal"/>
     <w:link w:val="Heading3Char"/>
     <w:uiPriority w:val="9"/>
-    <w:semiHidden/>
     <w:unhideWhenUsed/>
     <w:qFormat/>
     <w:rsid w:val="00F918E3"/>
@@ -3525,7 +6267,6 @@
     <w:basedOn w:val="DefaultParagraphFont"/>
     <w:link w:val="Heading2"/>
     <w:uiPriority w:val="9"/>
-    <w:semiHidden/>
     <w:rsid w:val="00F918E3"/>
     <w:rPr>
       <w:rFonts w:asciiTheme="majorHAnsi" w:eastAsiaTheme="majorEastAsia" w:hAnsiTheme="majorHAnsi" w:cstheme="majorBidi"/>
@@ -3539,7 +6280,6 @@
     <w:basedOn w:val="DefaultParagraphFont"/>
     <w:link w:val="Heading3"/>
     <w:uiPriority w:val="9"/>
-    <w:semiHidden/>
     <w:rsid w:val="00F918E3"/>
     <w:rPr>
       <w:rFonts w:eastAsiaTheme="majorEastAsia" w:cstheme="majorBidi"/>
@@ -3853,6 +6593,34 @@
       <w:kern w:val="0"/>
       <w:lang w:eastAsia="en-IN"/>
       <w14:ligatures w14:val="none"/>
+    </w:rPr>
+  </w:style>
+  <w:style w:type="paragraph" w:styleId="NormalWeb">
+    <w:name w:val="Normal (Web)"/>
+    <w:basedOn w:val="Normal"/>
+    <w:uiPriority w:val="99"/>
+    <w:semiHidden/>
+    <w:unhideWhenUsed/>
+    <w:rsid w:val="002E2899"/>
+    <w:pPr>
+      <w:spacing w:before="100" w:beforeAutospacing="1" w:after="100" w:afterAutospacing="1" w:line="240" w:lineRule="auto"/>
+    </w:pPr>
+    <w:rPr>
+      <w:rFonts w:ascii="Times New Roman" w:eastAsia="Times New Roman" w:hAnsi="Times New Roman" w:cs="Times New Roman"/>
+      <w:kern w:val="0"/>
+      <w:lang w:eastAsia="en-IN"/>
+      <w14:ligatures w14:val="none"/>
+    </w:rPr>
+  </w:style>
+  <w:style w:type="character" w:styleId="Strong">
+    <w:name w:val="Strong"/>
+    <w:basedOn w:val="DefaultParagraphFont"/>
+    <w:uiPriority w:val="22"/>
+    <w:qFormat/>
+    <w:rsid w:val="002E2899"/>
+    <w:rPr>
+      <w:b/>
+      <w:bCs/>
     </w:rPr>
   </w:style>
 </w:styles>

</xml_diff>